<commit_message>
Literature Handbook v2: 10 cards (D6), primer C7 and figures H10-H11 for the ML extensions E3-E4
Co-Authored-By: Claude Opus 5.5 <noreply@anthropic.com>
</commit_message>
<xml_diff>
--- a/docs/Literature_Handbook_Chapter2_v2.docx
+++ b/docs/Literature_Handbook_Chapter2_v2.docx
@@ -29,7 +29,7 @@
         <w:rPr>
           <w:i/>
         </w:rPr>
-        <w:t xml:space="preserve">Updated for the three-market design (ISEQ, S&amp;P 500, DAX; FTSE for robustness). 51 paper cards with 12 fields each (summary, dataset, methodology, results, relation to your study, exact pages to read, what to skip, key terms, strengths, weaknesses, how to use) · 9 original figures from your own data · key numbers · Irish timeline · concept primers · 24 September 2026, updated 30 September 2026 (5 new cards and 3 figures for the exploratory extensions and the closest new work; Gallagher &amp; Twomey correction)</w:t>
+        <w:t xml:space="preserve">Updated for the three-market design (ISEQ, S&amp;P 500, DAX; FTSE for robustness). 61 paper cards with 12 fields each (summary, dataset, methodology, results, relation to your study, exact pages to read, what to skip, key terms, strengths, weaknesses, how to use) · 11 original figures from your own data · key numbers · Irish timeline · concept primers · 24 September 2026, updated 30 September 2026 (5 new cards and 3 figures for the exploratory extensions and the closest new work; Gallagher &amp; Twomey correction), updated 1 October 2026 (10 new cards in D6, primer C7 and 2 figures for the exploratory extensions E3–E4)</w:t>
       </w:r>
     </w:p>
     <w:tbl>
@@ -236,7 +236,7 @@
         <w:rPr>
           <w:i w:val="0"/>
         </w:rPr>
-        <w:t>Contents: A. Key numbers · B. Irish timeline · C. Concept primers with figures · D. Paper cards (2.2 theory, 2.3 crises &amp; Ireland, 2.4 transmission, 2.5 forecasting, 2.6 explainability) · E. Reading order · F. From notes to paragraph · G. Where to read the originals.</w:t>
+        <w:t xml:space="preserve">Contents: A. Key numbers · B. Irish timeline · C. Concept primers with figures · D. Paper cards (2.2 theory, 2.3 crises &amp; Ireland, 2.4 transmission, 2.5 forecasting, 2.6 explainability, methods of E3–E4) · E. Reading order · F. From notes to paragraph · G. Where to read the originals.</w:t>
       </w:r>
     </w:p>
     <w:p>
@@ -1304,6 +1304,182 @@
                 <w:b w:val="0"/>
               </w:rPr>
               <w:t xml:space="preserve">Your data (FRED)</w:t>
+            </w:r>
+          </w:p>
+        </w:tc>
+      </w:tr>
+      <w:tr>
+        <w:tc>
+          <w:tcPr>
+            <w:tcW w:type="dxa" w:w="3175"/>
+          </w:tcPr>
+          <w:p>
+            <w:r>
+              <w:rPr>
+                <w:sz w:val="17"/>
+                <w:b w:val="0"/>
+              </w:rPr>
+              <w:t xml:space="preserve">Your E3 (exploratory)</w:t>
+            </w:r>
+          </w:p>
+        </w:tc>
+        <w:tc>
+          <w:tcPr>
+            <w:tcW w:type="dxa" w:w="4309"/>
+          </w:tcPr>
+          <w:p>
+            <w:r>
+              <w:rPr>
+                <w:sz w:val="17"/>
+                <w:b w:val="0"/>
+              </w:rPr>
+              <w:t xml:space="preserve">all-days QLIKE: Random Forest 0.456, SVR 0.457 vs GARCH 0.380; both under-forecast on 69% of GFC days; 2008 peak forecasts 21–23 vs actual 292 (× 10⁻⁴)</w:t>
+            </w:r>
+          </w:p>
+        </w:tc>
+        <w:tc>
+          <w:tcPr>
+            <w:tcW w:type="dxa" w:w="2381"/>
+          </w:tcPr>
+          <w:p>
+            <w:r>
+              <w:rPr>
+                <w:sz w:val="17"/>
+                <w:b w:val="0"/>
+              </w:rPr>
+              <w:t xml:space="preserve">Your data</w:t>
+            </w:r>
+          </w:p>
+        </w:tc>
+      </w:tr>
+      <w:tr>
+        <w:tc>
+          <w:tcPr>
+            <w:tcW w:type="dxa" w:w="3175"/>
+          </w:tcPr>
+          <w:p>
+            <w:r>
+              <w:rPr>
+                <w:sz w:val="17"/>
+                <w:b w:val="0"/>
+              </w:rPr>
+              <w:t xml:space="preserve">Your E4 (exploratory)</w:t>
+            </w:r>
+          </w:p>
+        </w:tc>
+        <w:tc>
+          <w:tcPr>
+            <w:tcW w:type="dxa" w:w="4309"/>
+          </w:tcPr>
+          <w:p>
+            <w:r>
+              <w:rPr>
+                <w:sz w:val="17"/>
+                <w:b w:val="0"/>
+              </w:rPr>
+              <w:t xml:space="preserve">GARCH hybrids 0.376 / 0.376 / 0.394 vs GARCH 0.380 (Holm p ≥ 0.36); their GFC QLIKE 0.36–0.46; HAR-X 0.361 overall but forecasts up to 9,955 × 10⁻⁴ in October 2008</w:t>
+            </w:r>
+          </w:p>
+        </w:tc>
+        <w:tc>
+          <w:tcPr>
+            <w:tcW w:type="dxa" w:w="2381"/>
+          </w:tcPr>
+          <w:p>
+            <w:r>
+              <w:rPr>
+                <w:sz w:val="17"/>
+                <w:b w:val="0"/>
+              </w:rPr>
+              <w:t xml:space="preserve">Your data</w:t>
+            </w:r>
+          </w:p>
+        </w:tc>
+      </w:tr>
+      <w:tr>
+        <w:tc>
+          <w:tcPr>
+            <w:tcW w:type="dxa" w:w="3175"/>
+          </w:tcPr>
+          <w:p>
+            <w:r>
+              <w:rPr>
+                <w:sz w:val="17"/>
+                <w:b w:val="0"/>
+              </w:rPr>
+              <w:t xml:space="preserve">Branco et al. (2024) set-up</w:t>
+            </w:r>
+          </w:p>
+        </w:tc>
+        <w:tc>
+          <w:tcPr>
+            <w:tcW w:type="dxa" w:w="4309"/>
+          </w:tcPr>
+          <w:p>
+            <w:r>
+              <w:rPr>
+                <w:sz w:val="17"/>
+                <w:b w:val="0"/>
+              </w:rPr>
+              <w:t xml:space="preserve">10 global stock indices, Jan 2000 – Dec 2021; ML under-forecasts in high-volatility periods</w:t>
+            </w:r>
+          </w:p>
+        </w:tc>
+        <w:tc>
+          <w:tcPr>
+            <w:tcW w:type="dxa" w:w="2381"/>
+          </w:tcPr>
+          <w:p>
+            <w:r>
+              <w:rPr>
+                <w:sz w:val="17"/>
+                <w:b w:val="0"/>
+              </w:rPr>
+              <w:t xml:space="preserve">Branco et al. (2024), abstract</w:t>
+            </w:r>
+          </w:p>
+        </w:tc>
+      </w:tr>
+      <w:tr>
+        <w:tc>
+          <w:tcPr>
+            <w:tcW w:type="dxa" w:w="3175"/>
+          </w:tcPr>
+          <w:p>
+            <w:r>
+              <w:rPr>
+                <w:sz w:val="17"/>
+                <w:b w:val="0"/>
+              </w:rPr>
+              <w:t xml:space="preserve">Audrino &amp; Chassot (2024) set-up</w:t>
+            </w:r>
+          </w:p>
+        </w:tc>
+        <w:tc>
+          <w:tcPr>
+            <w:tcW w:type="dxa" w:w="4309"/>
+          </w:tcPr>
+          <w:p>
+            <w:r>
+              <w:rPr>
+                <w:sz w:val="17"/>
+                <w:b w:val="0"/>
+              </w:rPr>
+              <w:t xml:space="preserve">1,445 US stocks, 2016 – Nov 2023; HAR (WLS) re-estimated daily beats every ML model</w:t>
+            </w:r>
+          </w:p>
+        </w:tc>
+        <w:tc>
+          <w:tcPr>
+            <w:tcW w:type="dxa" w:w="2381"/>
+          </w:tcPr>
+          <w:p>
+            <w:r>
+              <w:rPr>
+                <w:sz w:val="17"/>
+                <w:b w:val="0"/>
+              </w:rPr>
+              <w:t xml:space="preserve">Audrino &amp; Chassot (2024), Sections 3–5</w:t>
             </w:r>
           </w:p>
         </w:tc>
@@ -2933,6 +3109,207 @@
     </w:p>
     <w:p>
       <w:pPr>
+        <w:pStyle w:val="Heading2"/>
+      </w:pPr>
+      <w:r>
+        <w:rPr>
+          <w:color w:val="1F4E79"/>
+        </w:rPr>
+        <w:t xml:space="preserve">C7. Tools of the ML extensions E3–E4 (added 1 Oct 2026)</w:t>
+      </w:r>
+    </w:p>
+    <w:p>
+      <w:pPr>
+        <w:pStyle w:val="ListBullet"/>
+        <w:spacing w:after="20"/>
+      </w:pPr>
+      <w:r>
+        <w:rPr>
+          <w:b/>
+        </w:rPr>
+        <w:t xml:space="preserve">Time-ordered validation. </w:t>
+      </w:r>
+      <w:r>
+        <w:rPr/>
+        <w:t xml:space="preserve">TimeSeriesSplit always trains on earlier blocks and checks on the next one; a 5-day gap removes the days whose 5-day target overlaps the check block. The class default cv=5 lets a model learn from the future (Bergmeir &amp; Benítez, 2012).</w:t>
+      </w:r>
+    </w:p>
+    <w:p>
+      <w:pPr>
+        <w:pStyle w:val="ListBullet"/>
+        <w:spacing w:after="20"/>
+      </w:pPr>
+      <w:r>
+        <w:rPr>
+          <w:b/>
+        </w:rPr>
+        <w:t xml:space="preserve">The training-range ceiling. </w:t>
+      </w:r>
+      <w:r>
+        <w:rPr/>
+        <w:t xml:space="preserve">A Random Forest forecast is an average, and an XGBoost forecast a sum, of values learnt from training days; an RBF SVR falls back towards its average on unfamiliar days. None can forecast a crisis bigger than any in its history (Figure H10).</w:t>
+      </w:r>
+    </w:p>
+    <w:p>
+      <w:pPr>
+        <w:pStyle w:val="ListBullet"/>
+        <w:spacing w:after="20"/>
+      </w:pPr>
+      <w:r>
+        <w:rPr>
+          <w:b/>
+        </w:rPr>
+        <w:t xml:space="preserve">Hybrid target (E4). </w:t>
+      </w:r>
+      <w:r>
+        <w:rPr/>
+        <w:t xml:space="preserve">The learner forecasts only the correction log(RV5) − log(GARCH forecast); GARCH carries the level, so the ceiling no longer binds (Figure H11, top). The idea of feeding GARCH into a learner comes from Kim &amp; Won (2018).</w:t>
+      </w:r>
+    </w:p>
+    <w:p>
+      <w:pPr>
+        <w:pStyle w:val="ListBullet"/>
+        <w:spacing w:after="20"/>
+      </w:pPr>
+      <w:r>
+        <w:rPr>
+          <w:b/>
+        </w:rPr>
+        <w:t xml:space="preserve">Loss asymmetry. </w:t>
+      </w:r>
+      <w:r>
+        <w:rPr/>
+        <w:t xml:space="preserve">QLIKE punishes forecasts that are too low much more than forecasts that are too high; MSE punishes any large error. HAR-X is first on QLIKE and last on MSE (Figure H11, bottom) — always report both.</w:t>
+      </w:r>
+    </w:p>
+    <w:p>
+      <w:pPr>
+        <w:pStyle w:val="ListBullet"/>
+        <w:spacing w:after="20"/>
+      </w:pPr>
+      <w:r>
+        <w:rPr>
+          <w:b/>
+        </w:rPr>
+        <w:t xml:space="preserve">Multiple testing. </w:t>
+      </w:r>
+      <w:r>
+        <w:rPr/>
+        <w:t xml:space="preserve">With 14 models some will look better by chance. A3 names one primary family and adjusts it with Holm (1979); the other comparisons are descriptive.</w:t>
+      </w:r>
+    </w:p>
+    <w:p>
+      <w:r>
+        <w:drawing>
+          <wp:inline xmlns:a="http://schemas.openxmlformats.org/drawingml/2006/main" xmlns:pic="http://schemas.openxmlformats.org/drawingml/2006/picture">
+            <wp:extent cx="6192000" cy="2786400"/>
+            <wp:docPr id="10" name="Picture 10"/>
+            <wp:cNvGraphicFramePr>
+              <a:graphicFrameLocks noChangeAspect="1"/>
+            </wp:cNvGraphicFramePr>
+            <a:graphic>
+              <a:graphicData uri="http://schemas.openxmlformats.org/drawingml/2006/picture">
+                <pic:pic>
+                  <pic:nvPicPr>
+                    <pic:cNvPr id="0" name="ml_benchmarks_gfc.png"/>
+                    <pic:cNvPicPr/>
+                  </pic:nvPicPr>
+                  <pic:blipFill>
+                    <a:blip r:embed="rId18"/>
+                    <a:stretch>
+                      <a:fillRect/>
+                    </a:stretch>
+                  </pic:blipFill>
+                  <pic:spPr>
+                    <a:xfrm>
+                      <a:off x="0" y="0"/>
+                      <a:ext cx="6192000" cy="2786400"/>
+                    </a:xfrm>
+                    <a:prstGeom prst="rect"/>
+                  </pic:spPr>
+                </pic:pic>
+              </a:graphicData>
+            </a:graphic>
+          </wp:inline>
+        </w:drawing>
+      </w:r>
+    </w:p>
+    <w:p>
+      <w:pPr>
+        <w:spacing w:after="160"/>
+      </w:pPr>
+      <w:r>
+        <w:rPr>
+          <w:sz w:val="17"/>
+          <w:b/>
+        </w:rPr>
+        <w:t xml:space="preserve">Figure H10. </w:t>
+      </w:r>
+      <w:r>
+        <w:rPr>
+          <w:sz w:val="17"/>
+          <w:i/>
+        </w:rPr>
+        <w:t xml:space="preserve">Your data (E3): forecasts through the GFC, 2008 – mid 2009. GARCH climbs with the crisis; the LSTM, Random Forest and SVR stay below 40 (× 10⁻⁴) while realised variance reaches 292.</w:t>
+      </w:r>
+    </w:p>
+    <w:p>
+      <w:r>
+        <w:drawing>
+          <wp:inline xmlns:a="http://schemas.openxmlformats.org/drawingml/2006/main" xmlns:pic="http://schemas.openxmlformats.org/drawingml/2006/picture">
+            <wp:extent cx="6192000" cy="4334400"/>
+            <wp:docPr id="11" name="Picture 11"/>
+            <wp:cNvGraphicFramePr>
+              <a:graphicFrameLocks noChangeAspect="1"/>
+            </wp:cNvGraphicFramePr>
+            <a:graphic>
+              <a:graphicData uri="http://schemas.openxmlformats.org/drawingml/2006/picture">
+                <pic:pic>
+                  <pic:nvPicPr>
+                    <pic:cNvPr id="0" name="e4_hybrids_gfc.png"/>
+                    <pic:cNvPicPr/>
+                  </pic:nvPicPr>
+                  <pic:blipFill>
+                    <a:blip r:embed="rId19"/>
+                    <a:stretch>
+                      <a:fillRect/>
+                    </a:stretch>
+                  </pic:blipFill>
+                  <pic:spPr>
+                    <a:xfrm>
+                      <a:off x="0" y="0"/>
+                      <a:ext cx="6192000" cy="4334400"/>
+                    </a:xfrm>
+                    <a:prstGeom prst="rect"/>
+                  </pic:spPr>
+                </pic:pic>
+              </a:graphicData>
+            </a:graphic>
+          </wp:inline>
+        </w:drawing>
+      </w:r>
+    </w:p>
+    <w:p>
+      <w:pPr>
+        <w:spacing w:after="160"/>
+      </w:pPr>
+      <w:r>
+        <w:rPr>
+          <w:sz w:val="17"/>
+          <w:b/>
+        </w:rPr>
+        <w:t xml:space="preserve">Figure H11. </w:t>
+      </w:r>
+      <w:r>
+        <w:rPr>
+          <w:sz w:val="17"/>
+          <w:i/>
+        </w:rPr>
+        <w:t xml:space="preserve">Your data (E4): top, the GARCH hybrids follow the crisis peak (228–270 against 292) while plain XGBoost stays flat; bottom (log scale), HAR-X forecasts reach 9,955 in October 2008.</w:t>
+      </w:r>
+    </w:p>
+    <w:p>
+      <w:pPr>
         <w:pStyle w:val="Heading1"/>
       </w:pPr>
       <w:r>
@@ -23637,13 +24014,4189 @@
     </w:p>
     <w:p>
       <w:pPr>
+        <w:pStyle w:val="Heading2"/>
+      </w:pPr>
+      <w:r>
+        <w:rPr>
+          <w:color w:val="1F4E79"/>
+        </w:rPr>
+        <w:t xml:space="preserve">D6. Methods and evidence of the ML extensions E3–E4 (added 1 Oct 2026)</w:t>
+      </w:r>
+    </w:p>
+    <w:tbl>
+      <w:tblPr>
+        <w:tblStyle w:val="TableGrid"/>
+        <w:tblW w:type="auto" w:w="0"/>
+        <w:jc w:val="center"/>
+        <w:tblLook w:firstColumn="1" w:firstRow="1" w:lastColumn="0" w:lastRow="0" w:noHBand="0" w:noVBand="1" w:val="04A0"/>
+      </w:tblPr>
+      <w:tblGrid>
+        <w:gridCol w:w="5100"/>
+        <w:gridCol w:w="5100"/>
+      </w:tblGrid>
+      <w:tr>
+        <w:tc>
+          <w:tcPr>
+            <w:tcW w:type="dxa" w:w="8164"/>
+            <w:gridSpan w:val="2"/>
+            <w:shd w:val="clear" w:color="auto" w:fill="1F4E79"/>
+          </w:tcPr>
+          <w:p>
+            <w:r>
+              <w:rPr>
+                <w:color w:val="FFFFFF"/>
+                <w:sz w:val="19"/>
+                <w:b/>
+              </w:rPr>
+              <w:t xml:space="preserve">Breiman, L. (2001) Random forests. Machine Learning, 45(1), 5–32.</w:t>
+            </w:r>
+          </w:p>
+        </w:tc>
+      </w:tr>
+      <w:tr>
+        <w:tc>
+          <w:tcPr>
+            <w:tcW w:type="dxa" w:w="1701"/>
+            <w:shd w:val="clear" w:color="auto" w:fill="EFEFEF"/>
+          </w:tcPr>
+          <w:p>
+            <w:r>
+              <w:rPr>
+                <w:b/>
+                <w:sz w:val="16"/>
+              </w:rPr>
+              <w:t>Source basis</w:t>
+            </w:r>
+          </w:p>
+        </w:tc>
+        <w:tc>
+          <w:tcPr>
+            <w:tcW w:type="dxa" w:w="8164"/>
+            <w:shd w:val="clear" w:color="auto" w:fill="EFEFEF"/>
+          </w:tcPr>
+          <w:p>
+            <w:r>
+              <w:rPr>
+                <w:sz w:val="16"/>
+              </w:rPr>
+              <w:t>STANDARD KNOWLEDGE, not re-read this session; confirm every detail and page before citing</w:t>
+            </w:r>
+          </w:p>
+        </w:tc>
+      </w:tr>
+      <w:tr>
+        <w:tc>
+          <w:tcPr>
+            <w:tcW w:type="dxa" w:w="1701"/>
+          </w:tcPr>
+          <w:p>
+            <w:r>
+              <w:rPr>
+                <w:b/>
+                <w:sz w:val="16"/>
+              </w:rPr>
+              <w:t>Summary</w:t>
+            </w:r>
+          </w:p>
+        </w:tc>
+        <w:tc>
+          <w:tcPr>
+            <w:tcW w:type="dxa" w:w="8164"/>
+          </w:tcPr>
+          <w:p>
+            <w:r>
+              <w:rPr>
+                <w:sz w:val="16"/>
+                <w:b w:val="0"/>
+              </w:rPr>
+              <w:t xml:space="preserve">Introduces random forests: many decision trees, each grown on a bootstrap sample and choosing among a random subset of inputs at each split; the forecast is the average of the trees.</w:t>
+            </w:r>
+          </w:p>
+        </w:tc>
+      </w:tr>
+      <w:tr>
+        <w:tc>
+          <w:tcPr>
+            <w:tcW w:type="dxa" w:w="1701"/>
+          </w:tcPr>
+          <w:p>
+            <w:r>
+              <w:rPr>
+                <w:b/>
+                <w:sz w:val="16"/>
+              </w:rPr>
+              <w:t>Dataset</w:t>
+            </w:r>
+          </w:p>
+        </w:tc>
+        <w:tc>
+          <w:tcPr>
+            <w:tcW w:type="dxa" w:w="8164"/>
+          </w:tcPr>
+          <w:p>
+            <w:r>
+              <w:rPr>
+                <w:sz w:val="16"/>
+                <w:b w:val="0"/>
+              </w:rPr>
+              <w:t xml:space="preserve">Benchmark data sets and simulations (confirm).</w:t>
+            </w:r>
+          </w:p>
+        </w:tc>
+      </w:tr>
+      <w:tr>
+        <w:tc>
+          <w:tcPr>
+            <w:tcW w:type="dxa" w:w="1701"/>
+          </w:tcPr>
+          <w:p>
+            <w:r>
+              <w:rPr>
+                <w:b/>
+                <w:sz w:val="16"/>
+              </w:rPr>
+              <w:t>Methodology</w:t>
+            </w:r>
+          </w:p>
+        </w:tc>
+        <w:tc>
+          <w:tcPr>
+            <w:tcW w:type="dxa" w:w="8164"/>
+          </w:tcPr>
+          <w:p>
+            <w:r>
+              <w:rPr>
+                <w:sz w:val="16"/>
+                <w:b w:val="0"/>
+              </w:rPr>
+              <w:t xml:space="preserve">Bagging plus random input selection; out-of-bag error estimates; variable importance.</w:t>
+            </w:r>
+          </w:p>
+        </w:tc>
+      </w:tr>
+      <w:tr>
+        <w:tc>
+          <w:tcPr>
+            <w:tcW w:type="dxa" w:w="1701"/>
+          </w:tcPr>
+          <w:p>
+            <w:r>
+              <w:rPr>
+                <w:b/>
+                <w:sz w:val="16"/>
+              </w:rPr>
+              <w:t>Results</w:t>
+            </w:r>
+          </w:p>
+        </w:tc>
+        <w:tc>
+          <w:tcPr>
+            <w:tcW w:type="dxa" w:w="8164"/>
+          </w:tcPr>
+          <w:p>
+            <w:r>
+              <w:rPr>
+                <w:sz w:val="16"/>
+                <w:b w:val="0"/>
+              </w:rPr>
+              <w:t xml:space="preserve">• Accuracy comparable to boosting and robust to noise.</w:t>
+            </w:r>
+          </w:p>
+          <w:p>
+            <w:r>
+              <w:rPr>
+                <w:sz w:val="16"/>
+                <w:b w:val="0"/>
+              </w:rPr>
+              <w:t xml:space="preserve">• Out-of-bag error gives an honest error estimate without a separate test set.</w:t>
+            </w:r>
+          </w:p>
+          <w:p>
+            <w:r>
+              <w:rPr>
+                <w:sz w:val="16"/>
+                <w:b w:val="0"/>
+              </w:rPr>
+              <w:t xml:space="preserve">• Adding more trees does not over-fit.</w:t>
+            </w:r>
+          </w:p>
+        </w:tc>
+      </w:tr>
+      <w:tr>
+        <w:tc>
+          <w:tcPr>
+            <w:tcW w:type="dxa" w:w="1701"/>
+            <w:shd w:val="clear" w:color="auto" w:fill="EAF1FB"/>
+          </w:tcPr>
+          <w:p>
+            <w:r>
+              <w:rPr>
+                <w:b/>
+                <w:sz w:val="16"/>
+              </w:rPr>
+              <w:t>How it relates to MY study</w:t>
+            </w:r>
+          </w:p>
+        </w:tc>
+        <w:tc>
+          <w:tcPr>
+            <w:tcW w:type="dxa" w:w="8164"/>
+            <w:shd w:val="clear" w:color="auto" w:fill="EAF1FB"/>
+          </w:tcPr>
+          <w:p>
+            <w:r>
+              <w:rPr>
+                <w:sz w:val="16"/>
+                <w:b w:val="0"/>
+              </w:rPr>
+              <w:t xml:space="preserve">Your E3 Random Forest (taught in the MSc module). A forest's forecast is an average of training targets, so it can never exceed the largest value it has seen — the ceiling behind its GFC failure (2008 peak forecast 21 against an actual 292, × 10⁻⁴).</w:t>
+            </w:r>
+          </w:p>
+        </w:tc>
+      </w:tr>
+      <w:tr>
+        <w:tc>
+          <w:tcPr>
+            <w:tcW w:type="dxa" w:w="1701"/>
+            <w:shd w:val="clear" w:color="auto" w:fill="EAF1FB"/>
+          </w:tcPr>
+          <w:p>
+            <w:r>
+              <w:rPr>
+                <w:b/>
+                <w:sz w:val="16"/>
+              </w:rPr>
+              <w:t>Must read in the original</w:t>
+            </w:r>
+          </w:p>
+        </w:tc>
+        <w:tc>
+          <w:tcPr>
+            <w:tcW w:type="dxa" w:w="8164"/>
+            <w:shd w:val="clear" w:color="auto" w:fill="EAF1FB"/>
+          </w:tcPr>
+          <w:p>
+            <w:r>
+              <w:rPr>
+                <w:sz w:val="16"/>
+                <w:b w:val="0"/>
+              </w:rPr>
+              <w:t xml:space="preserve">The definition of the forest, out-of-bag estimates and variable importance (confirm sections in your copy).</w:t>
+            </w:r>
+          </w:p>
+        </w:tc>
+      </w:tr>
+      <w:tr>
+        <w:tc>
+          <w:tcPr>
+            <w:tcW w:type="dxa" w:w="1701"/>
+          </w:tcPr>
+          <w:p>
+            <w:r>
+              <w:rPr>
+                <w:b/>
+                <w:sz w:val="16"/>
+              </w:rPr>
+              <w:t>Can skim / skip</w:t>
+            </w:r>
+          </w:p>
+        </w:tc>
+        <w:tc>
+          <w:tcPr>
+            <w:tcW w:type="dxa" w:w="8164"/>
+          </w:tcPr>
+          <w:p>
+            <w:r>
+              <w:rPr>
+                <w:sz w:val="16"/>
+                <w:b w:val="0"/>
+              </w:rPr>
+              <w:t xml:space="preserve">Convergence and strength–correlation theory.</w:t>
+            </w:r>
+          </w:p>
+        </w:tc>
+      </w:tr>
+      <w:tr>
+        <w:tc>
+          <w:tcPr>
+            <w:tcW w:type="dxa" w:w="1701"/>
+          </w:tcPr>
+          <w:p>
+            <w:r>
+              <w:rPr>
+                <w:b/>
+                <w:sz w:val="16"/>
+              </w:rPr>
+              <w:t>Key terms</w:t>
+            </w:r>
+          </w:p>
+        </w:tc>
+        <w:tc>
+          <w:tcPr>
+            <w:tcW w:type="dxa" w:w="8164"/>
+          </w:tcPr>
+          <w:p>
+            <w:r>
+              <w:rPr>
+                <w:sz w:val="16"/>
+                <w:b w:val="0"/>
+              </w:rPr>
+              <w:t xml:space="preserve">bagging; out-of-bag; max_features; variable importance</w:t>
+            </w:r>
+          </w:p>
+        </w:tc>
+      </w:tr>
+      <w:tr>
+        <w:tc>
+          <w:tcPr>
+            <w:tcW w:type="dxa" w:w="1701"/>
+          </w:tcPr>
+          <w:p>
+            <w:r>
+              <w:rPr>
+                <w:b/>
+                <w:sz w:val="16"/>
+              </w:rPr>
+              <w:t>Strengths</w:t>
+            </w:r>
+          </w:p>
+        </w:tc>
+        <w:tc>
+          <w:tcPr>
+            <w:tcW w:type="dxa" w:w="8164"/>
+          </w:tcPr>
+          <w:p>
+            <w:r>
+              <w:rPr>
+                <w:sz w:val="16"/>
+                <w:b w:val="0"/>
+              </w:rPr>
+              <w:t xml:space="preserve">Few settings; hard to over-fit; works well out of the box.</w:t>
+            </w:r>
+          </w:p>
+        </w:tc>
+      </w:tr>
+      <w:tr>
+        <w:tc>
+          <w:tcPr>
+            <w:tcW w:type="dxa" w:w="1701"/>
+          </w:tcPr>
+          <w:p>
+            <w:r>
+              <w:rPr>
+                <w:b/>
+                <w:sz w:val="16"/>
+              </w:rPr>
+              <w:t>Weaknesses / critique</w:t>
+            </w:r>
+          </w:p>
+        </w:tc>
+        <w:tc>
+          <w:tcPr>
+            <w:tcW w:type="dxa" w:w="8164"/>
+          </w:tcPr>
+          <w:p>
+            <w:r>
+              <w:rPr>
+                <w:sz w:val="16"/>
+                <w:b w:val="0"/>
+              </w:rPr>
+              <w:t xml:space="preserve">Cannot extrapolate beyond the training range; impurity importance is biased when inputs are correlated.</w:t>
+            </w:r>
+          </w:p>
+        </w:tc>
+      </w:tr>
+      <w:tr>
+        <w:tc>
+          <w:tcPr>
+            <w:tcW w:type="dxa" w:w="1701"/>
+            <w:shd w:val="clear" w:color="auto" w:fill="EAF1FB"/>
+          </w:tcPr>
+          <w:p>
+            <w:r>
+              <w:rPr>
+                <w:b/>
+                <w:sz w:val="16"/>
+              </w:rPr>
+              <w:t>Use it as · where</w:t>
+            </w:r>
+          </w:p>
+        </w:tc>
+        <w:tc>
+          <w:tcPr>
+            <w:tcW w:type="dxa" w:w="8164"/>
+            <w:shd w:val="clear" w:color="auto" w:fill="EAF1FB"/>
+          </w:tcPr>
+          <w:p>
+            <w:r>
+              <w:rPr>
+                <w:sz w:val="16"/>
+                <w:b w:val="0"/>
+              </w:rPr>
+              <w:t xml:space="preserve">Method · Chapter 3 (E3); Discussion of the training-range ceiling</w:t>
+            </w:r>
+          </w:p>
+        </w:tc>
+      </w:tr>
+    </w:tbl>
+    <w:p>
+      <w:pPr>
+        <w:spacing w:after="80"/>
+      </w:pPr>
+    </w:p>
+    <w:tbl>
+      <w:tblPr>
+        <w:tblStyle w:val="TableGrid"/>
+        <w:tblW w:type="auto" w:w="0"/>
+        <w:jc w:val="center"/>
+        <w:tblLook w:firstColumn="1" w:firstRow="1" w:lastColumn="0" w:lastRow="0" w:noHBand="0" w:noVBand="1" w:val="04A0"/>
+      </w:tblPr>
+      <w:tblGrid>
+        <w:gridCol w:w="5100"/>
+        <w:gridCol w:w="5100"/>
+      </w:tblGrid>
+      <w:tr>
+        <w:tc>
+          <w:tcPr>
+            <w:tcW w:type="dxa" w:w="8164"/>
+            <w:gridSpan w:val="2"/>
+            <w:shd w:val="clear" w:color="auto" w:fill="1F4E79"/>
+          </w:tcPr>
+          <w:p>
+            <w:r>
+              <w:rPr>
+                <w:color w:val="FFFFFF"/>
+                <w:sz w:val="19"/>
+                <w:b/>
+              </w:rPr>
+              <w:t xml:space="preserve">Drucker, H., Burges, C., Kaufman, L., Smola, A. &amp; Vapnik, V. (1997) Support vector regression machines. Advances in Neural Information Processing Systems 9, 155–161.</w:t>
+            </w:r>
+          </w:p>
+        </w:tc>
+      </w:tr>
+      <w:tr>
+        <w:tc>
+          <w:tcPr>
+            <w:tcW w:type="dxa" w:w="1701"/>
+            <w:shd w:val="clear" w:color="auto" w:fill="EFEFEF"/>
+          </w:tcPr>
+          <w:p>
+            <w:r>
+              <w:rPr>
+                <w:b/>
+                <w:sz w:val="16"/>
+              </w:rPr>
+              <w:t>Source basis</w:t>
+            </w:r>
+          </w:p>
+        </w:tc>
+        <w:tc>
+          <w:tcPr>
+            <w:tcW w:type="dxa" w:w="8164"/>
+            <w:shd w:val="clear" w:color="auto" w:fill="EFEFEF"/>
+          </w:tcPr>
+          <w:p>
+            <w:r>
+              <w:rPr>
+                <w:sz w:val="16"/>
+              </w:rPr>
+              <w:t>STANDARD KNOWLEDGE, not re-read this session; confirm every detail and page before citing</w:t>
+            </w:r>
+          </w:p>
+        </w:tc>
+      </w:tr>
+      <w:tr>
+        <w:tc>
+          <w:tcPr>
+            <w:tcW w:type="dxa" w:w="1701"/>
+          </w:tcPr>
+          <w:p>
+            <w:r>
+              <w:rPr>
+                <w:b/>
+                <w:sz w:val="16"/>
+              </w:rPr>
+              <w:t>Summary</w:t>
+            </w:r>
+          </w:p>
+        </w:tc>
+        <w:tc>
+          <w:tcPr>
+            <w:tcW w:type="dxa" w:w="8164"/>
+          </w:tcPr>
+          <w:p>
+            <w:r>
+              <w:rPr>
+                <w:sz w:val="16"/>
+                <w:b w:val="0"/>
+              </w:rPr>
+              <w:t xml:space="preserve">Extends support vector machines to regression: errors smaller than ε are ignored, C trades flatness against errors, and kernels allow non-linear fits.</w:t>
+            </w:r>
+          </w:p>
+        </w:tc>
+      </w:tr>
+      <w:tr>
+        <w:tc>
+          <w:tcPr>
+            <w:tcW w:type="dxa" w:w="1701"/>
+          </w:tcPr>
+          <w:p>
+            <w:r>
+              <w:rPr>
+                <w:b/>
+                <w:sz w:val="16"/>
+              </w:rPr>
+              <w:t>Dataset</w:t>
+            </w:r>
+          </w:p>
+        </w:tc>
+        <w:tc>
+          <w:tcPr>
+            <w:tcW w:type="dxa" w:w="8164"/>
+          </w:tcPr>
+          <w:p>
+            <w:r>
+              <w:rPr>
+                <w:sz w:val="16"/>
+                <w:b w:val="0"/>
+              </w:rPr>
+              <w:t xml:space="preserve">Simulated test functions and a standard regression data set (confirm).</w:t>
+            </w:r>
+          </w:p>
+        </w:tc>
+      </w:tr>
+      <w:tr>
+        <w:tc>
+          <w:tcPr>
+            <w:tcW w:type="dxa" w:w="1701"/>
+          </w:tcPr>
+          <w:p>
+            <w:r>
+              <w:rPr>
+                <w:b/>
+                <w:sz w:val="16"/>
+              </w:rPr>
+              <w:t>Methodology</w:t>
+            </w:r>
+          </w:p>
+        </w:tc>
+        <w:tc>
+          <w:tcPr>
+            <w:tcW w:type="dxa" w:w="8164"/>
+          </w:tcPr>
+          <w:p>
+            <w:r>
+              <w:rPr>
+                <w:sz w:val="16"/>
+                <w:b w:val="0"/>
+              </w:rPr>
+              <w:t xml:space="preserve">ε-insensitive loss; kernel functions; comparison with bagged regression trees.</w:t>
+            </w:r>
+          </w:p>
+        </w:tc>
+      </w:tr>
+      <w:tr>
+        <w:tc>
+          <w:tcPr>
+            <w:tcW w:type="dxa" w:w="1701"/>
+          </w:tcPr>
+          <w:p>
+            <w:r>
+              <w:rPr>
+                <w:b/>
+                <w:sz w:val="16"/>
+              </w:rPr>
+              <w:t>Results</w:t>
+            </w:r>
+          </w:p>
+        </w:tc>
+        <w:tc>
+          <w:tcPr>
+            <w:tcW w:type="dxa" w:w="8164"/>
+          </w:tcPr>
+          <w:p>
+            <w:r>
+              <w:rPr>
+                <w:sz w:val="16"/>
+                <w:b w:val="0"/>
+              </w:rPr>
+              <w:t xml:space="preserve">• SVR did as well as or better than bagged trees.</w:t>
+            </w:r>
+          </w:p>
+          <w:p>
+            <w:r>
+              <w:rPr>
+                <w:sz w:val="16"/>
+                <w:b w:val="0"/>
+              </w:rPr>
+              <w:t xml:space="preserve">• Only the support vectors determine the fit.</w:t>
+            </w:r>
+          </w:p>
+        </w:tc>
+      </w:tr>
+      <w:tr>
+        <w:tc>
+          <w:tcPr>
+            <w:tcW w:type="dxa" w:w="1701"/>
+            <w:shd w:val="clear" w:color="auto" w:fill="EAF1FB"/>
+          </w:tcPr>
+          <w:p>
+            <w:r>
+              <w:rPr>
+                <w:b/>
+                <w:sz w:val="16"/>
+              </w:rPr>
+              <w:t>How it relates to MY study</w:t>
+            </w:r>
+          </w:p>
+        </w:tc>
+        <w:tc>
+          <w:tcPr>
+            <w:tcW w:type="dxa" w:w="8164"/>
+            <w:shd w:val="clear" w:color="auto" w:fill="EAF1FB"/>
+          </w:tcPr>
+          <w:p>
+            <w:r>
+              <w:rPr>
+                <w:sz w:val="16"/>
+                <w:b w:val="0"/>
+              </w:rPr>
+              <w:t xml:space="preserve">Your E3 SVR. With an RBF kernel, a day unlike any training day gets little weight, so the forecast falls back towards the model's average — your 2008 shock test (× 1.2 at a −20% day).</w:t>
+            </w:r>
+          </w:p>
+        </w:tc>
+      </w:tr>
+      <w:tr>
+        <w:tc>
+          <w:tcPr>
+            <w:tcW w:type="dxa" w:w="1701"/>
+            <w:shd w:val="clear" w:color="auto" w:fill="EAF1FB"/>
+          </w:tcPr>
+          <w:p>
+            <w:r>
+              <w:rPr>
+                <w:b/>
+                <w:sz w:val="16"/>
+              </w:rPr>
+              <w:t>Must read in the original</w:t>
+            </w:r>
+          </w:p>
+        </w:tc>
+        <w:tc>
+          <w:tcPr>
+            <w:tcW w:type="dxa" w:w="8164"/>
+            <w:shd w:val="clear" w:color="auto" w:fill="EAF1FB"/>
+          </w:tcPr>
+          <w:p>
+            <w:r>
+              <w:rPr>
+                <w:sz w:val="16"/>
+                <w:b w:val="0"/>
+              </w:rPr>
+              <w:t xml:space="preserve">The method section (ε-insensitive loss, kernels).</w:t>
+            </w:r>
+          </w:p>
+        </w:tc>
+      </w:tr>
+      <w:tr>
+        <w:tc>
+          <w:tcPr>
+            <w:tcW w:type="dxa" w:w="1701"/>
+          </w:tcPr>
+          <w:p>
+            <w:r>
+              <w:rPr>
+                <w:b/>
+                <w:sz w:val="16"/>
+              </w:rPr>
+              <w:t>Can skim / skip</w:t>
+            </w:r>
+          </w:p>
+        </w:tc>
+        <w:tc>
+          <w:tcPr>
+            <w:tcW w:type="dxa" w:w="8164"/>
+          </w:tcPr>
+          <w:p>
+            <w:r>
+              <w:rPr>
+                <w:sz w:val="16"/>
+                <w:b w:val="0"/>
+              </w:rPr>
+              <w:t xml:space="preserve">Experimental details.</w:t>
+            </w:r>
+          </w:p>
+        </w:tc>
+      </w:tr>
+      <w:tr>
+        <w:tc>
+          <w:tcPr>
+            <w:tcW w:type="dxa" w:w="1701"/>
+          </w:tcPr>
+          <w:p>
+            <w:r>
+              <w:rPr>
+                <w:b/>
+                <w:sz w:val="16"/>
+              </w:rPr>
+              <w:t>Key terms</w:t>
+            </w:r>
+          </w:p>
+        </w:tc>
+        <w:tc>
+          <w:tcPr>
+            <w:tcW w:type="dxa" w:w="8164"/>
+          </w:tcPr>
+          <w:p>
+            <w:r>
+              <w:rPr>
+                <w:sz w:val="16"/>
+                <w:b w:val="0"/>
+              </w:rPr>
+              <w:t xml:space="preserve">ε-insensitive loss; kernel; C; gamma; support vectors</w:t>
+            </w:r>
+          </w:p>
+        </w:tc>
+      </w:tr>
+      <w:tr>
+        <w:tc>
+          <w:tcPr>
+            <w:tcW w:type="dxa" w:w="1701"/>
+          </w:tcPr>
+          <w:p>
+            <w:r>
+              <w:rPr>
+                <w:b/>
+                <w:sz w:val="16"/>
+              </w:rPr>
+              <w:t>Strengths</w:t>
+            </w:r>
+          </w:p>
+        </w:tc>
+        <w:tc>
+          <w:tcPr>
+            <w:tcW w:type="dxa" w:w="8164"/>
+          </w:tcPr>
+          <w:p>
+            <w:r>
+              <w:rPr>
+                <w:sz w:val="16"/>
+                <w:b w:val="0"/>
+              </w:rPr>
+              <w:t xml:space="preserve">Handles non-linearity with few settings; regularised.</w:t>
+            </w:r>
+          </w:p>
+        </w:tc>
+      </w:tr>
+      <w:tr>
+        <w:tc>
+          <w:tcPr>
+            <w:tcW w:type="dxa" w:w="1701"/>
+          </w:tcPr>
+          <w:p>
+            <w:r>
+              <w:rPr>
+                <w:b/>
+                <w:sz w:val="16"/>
+              </w:rPr>
+              <w:t>Weaknesses / critique</w:t>
+            </w:r>
+          </w:p>
+        </w:tc>
+        <w:tc>
+          <w:tcPr>
+            <w:tcW w:type="dxa" w:w="8164"/>
+          </w:tcPr>
+          <w:p>
+            <w:r>
+              <w:rPr>
+                <w:sz w:val="16"/>
+                <w:b w:val="0"/>
+              </w:rPr>
+              <w:t xml:space="preserve">Needs scaled inputs; slow on large samples; RBF kernels cannot extrapolate.</w:t>
+            </w:r>
+          </w:p>
+        </w:tc>
+      </w:tr>
+      <w:tr>
+        <w:tc>
+          <w:tcPr>
+            <w:tcW w:type="dxa" w:w="1701"/>
+            <w:shd w:val="clear" w:color="auto" w:fill="EAF1FB"/>
+          </w:tcPr>
+          <w:p>
+            <w:r>
+              <w:rPr>
+                <w:b/>
+                <w:sz w:val="16"/>
+              </w:rPr>
+              <w:t>Use it as · where</w:t>
+            </w:r>
+          </w:p>
+        </w:tc>
+        <w:tc>
+          <w:tcPr>
+            <w:tcW w:type="dxa" w:w="8164"/>
+            <w:shd w:val="clear" w:color="auto" w:fill="EAF1FB"/>
+          </w:tcPr>
+          <w:p>
+            <w:r>
+              <w:rPr>
+                <w:sz w:val="16"/>
+                <w:b w:val="0"/>
+              </w:rPr>
+              <w:t xml:space="preserve">Method · Chapter 3 (E3)</w:t>
+            </w:r>
+          </w:p>
+        </w:tc>
+      </w:tr>
+    </w:tbl>
+    <w:p>
+      <w:pPr>
+        <w:spacing w:after="80"/>
+      </w:pPr>
+    </w:p>
+    <w:tbl>
+      <w:tblPr>
+        <w:tblStyle w:val="TableGrid"/>
+        <w:tblW w:type="auto" w:w="0"/>
+        <w:jc w:val="center"/>
+        <w:tblLook w:firstColumn="1" w:firstRow="1" w:lastColumn="0" w:lastRow="0" w:noHBand="0" w:noVBand="1" w:val="04A0"/>
+      </w:tblPr>
+      <w:tblGrid>
+        <w:gridCol w:w="5100"/>
+        <w:gridCol w:w="5100"/>
+      </w:tblGrid>
+      <w:tr>
+        <w:tc>
+          <w:tcPr>
+            <w:tcW w:type="dxa" w:w="8164"/>
+            <w:gridSpan w:val="2"/>
+            <w:shd w:val="clear" w:color="auto" w:fill="1F4E79"/>
+          </w:tcPr>
+          <w:p>
+            <w:r>
+              <w:rPr>
+                <w:color w:val="FFFFFF"/>
+                <w:sz w:val="19"/>
+                <w:b/>
+              </w:rPr>
+              <w:t xml:space="preserve">Chen, T. &amp; Guestrin, C. (2016) XGBoost: a scalable tree boosting system. Proceedings of the 22nd ACM SIGKDD Conference (KDD '16), 785–794.</w:t>
+            </w:r>
+          </w:p>
+        </w:tc>
+      </w:tr>
+      <w:tr>
+        <w:tc>
+          <w:tcPr>
+            <w:tcW w:type="dxa" w:w="1701"/>
+            <w:shd w:val="clear" w:color="auto" w:fill="EFEFEF"/>
+          </w:tcPr>
+          <w:p>
+            <w:r>
+              <w:rPr>
+                <w:b/>
+                <w:sz w:val="16"/>
+              </w:rPr>
+              <w:t>Source basis</w:t>
+            </w:r>
+          </w:p>
+        </w:tc>
+        <w:tc>
+          <w:tcPr>
+            <w:tcW w:type="dxa" w:w="8164"/>
+            <w:shd w:val="clear" w:color="auto" w:fill="EFEFEF"/>
+          </w:tcPr>
+          <w:p>
+            <w:r>
+              <w:rPr>
+                <w:sz w:val="16"/>
+              </w:rPr>
+              <w:t>STANDARD KNOWLEDGE, not re-read this session; confirm every detail and page before citing</w:t>
+            </w:r>
+          </w:p>
+        </w:tc>
+      </w:tr>
+      <w:tr>
+        <w:tc>
+          <w:tcPr>
+            <w:tcW w:type="dxa" w:w="1701"/>
+          </w:tcPr>
+          <w:p>
+            <w:r>
+              <w:rPr>
+                <w:b/>
+                <w:sz w:val="16"/>
+              </w:rPr>
+              <w:t>Summary</w:t>
+            </w:r>
+          </w:p>
+        </w:tc>
+        <w:tc>
+          <w:tcPr>
+            <w:tcW w:type="dxa" w:w="8164"/>
+          </w:tcPr>
+          <w:p>
+            <w:r>
+              <w:rPr>
+                <w:sz w:val="16"/>
+                <w:b w:val="0"/>
+              </w:rPr>
+              <w:t xml:space="preserve">Describes XGBoost: gradient boosting of trees, each tree fitted to the errors of the trees before it, with regularisation and fast, scalable computation.</w:t>
+            </w:r>
+          </w:p>
+        </w:tc>
+      </w:tr>
+      <w:tr>
+        <w:tc>
+          <w:tcPr>
+            <w:tcW w:type="dxa" w:w="1701"/>
+          </w:tcPr>
+          <w:p>
+            <w:r>
+              <w:rPr>
+                <w:b/>
+                <w:sz w:val="16"/>
+              </w:rPr>
+              <w:t>Dataset</w:t>
+            </w:r>
+          </w:p>
+        </w:tc>
+        <w:tc>
+          <w:tcPr>
+            <w:tcW w:type="dxa" w:w="8164"/>
+          </w:tcPr>
+          <w:p>
+            <w:r>
+              <w:rPr>
+                <w:sz w:val="16"/>
+                <w:b w:val="0"/>
+              </w:rPr>
+              <w:t xml:space="preserve">Large benchmark data sets (confirm).</w:t>
+            </w:r>
+          </w:p>
+        </w:tc>
+      </w:tr>
+      <w:tr>
+        <w:tc>
+          <w:tcPr>
+            <w:tcW w:type="dxa" w:w="1701"/>
+          </w:tcPr>
+          <w:p>
+            <w:r>
+              <w:rPr>
+                <w:b/>
+                <w:sz w:val="16"/>
+              </w:rPr>
+              <w:t>Methodology</w:t>
+            </w:r>
+          </w:p>
+        </w:tc>
+        <w:tc>
+          <w:tcPr>
+            <w:tcW w:type="dxa" w:w="8164"/>
+          </w:tcPr>
+          <w:p>
+            <w:r>
+              <w:rPr>
+                <w:sz w:val="16"/>
+                <w:b w:val="0"/>
+              </w:rPr>
+              <w:t xml:space="preserve">Regularised objective; second-order approximation; shrinkage (learning rate) and column subsampling; sparsity-aware split finding.</w:t>
+            </w:r>
+          </w:p>
+        </w:tc>
+      </w:tr>
+      <w:tr>
+        <w:tc>
+          <w:tcPr>
+            <w:tcW w:type="dxa" w:w="1701"/>
+          </w:tcPr>
+          <w:p>
+            <w:r>
+              <w:rPr>
+                <w:b/>
+                <w:sz w:val="16"/>
+              </w:rPr>
+              <w:t>Results</w:t>
+            </w:r>
+          </w:p>
+        </w:tc>
+        <w:tc>
+          <w:tcPr>
+            <w:tcW w:type="dxa" w:w="8164"/>
+          </w:tcPr>
+          <w:p>
+            <w:r>
+              <w:rPr>
+                <w:sz w:val="16"/>
+                <w:b w:val="0"/>
+              </w:rPr>
+              <w:t xml:space="preserve">• Strong results in many machine-learning competitions.</w:t>
+            </w:r>
+          </w:p>
+          <w:p>
+            <w:r>
+              <w:rPr>
+                <w:sz w:val="16"/>
+                <w:b w:val="0"/>
+              </w:rPr>
+              <w:t xml:space="preserve">• Scales to very large data sets.</w:t>
+            </w:r>
+          </w:p>
+        </w:tc>
+      </w:tr>
+      <w:tr>
+        <w:tc>
+          <w:tcPr>
+            <w:tcW w:type="dxa" w:w="1701"/>
+            <w:shd w:val="clear" w:color="auto" w:fill="EAF1FB"/>
+          </w:tcPr>
+          <w:p>
+            <w:r>
+              <w:rPr>
+                <w:b/>
+                <w:sz w:val="16"/>
+              </w:rPr>
+              <w:t>How it relates to MY study</w:t>
+            </w:r>
+          </w:p>
+        </w:tc>
+        <w:tc>
+          <w:tcPr>
+            <w:tcW w:type="dxa" w:w="8164"/>
+            <w:shd w:val="clear" w:color="auto" w:fill="EAF1FB"/>
+          </w:tcPr>
+          <w:p>
+            <w:r>
+              <w:rPr>
+                <w:sz w:val="16"/>
+                <w:b w:val="0"/>
+              </w:rPr>
+              <w:t xml:space="preserve">Your E4 XGBoost failed in the GFC like the Random Forest (QLIKE 0.925; 2008 peak forecast 27 against 292): a sum of leaf values learnt from calm years cannot reach crisis levels. As a GARCH hybrid its GFC QLIKE fell to 0.455.</w:t>
+            </w:r>
+          </w:p>
+        </w:tc>
+      </w:tr>
+      <w:tr>
+        <w:tc>
+          <w:tcPr>
+            <w:tcW w:type="dxa" w:w="1701"/>
+            <w:shd w:val="clear" w:color="auto" w:fill="EAF1FB"/>
+          </w:tcPr>
+          <w:p>
+            <w:r>
+              <w:rPr>
+                <w:b/>
+                <w:sz w:val="16"/>
+              </w:rPr>
+              <w:t>Must read in the original</w:t>
+            </w:r>
+          </w:p>
+        </w:tc>
+        <w:tc>
+          <w:tcPr>
+            <w:tcW w:type="dxa" w:w="8164"/>
+            <w:shd w:val="clear" w:color="auto" w:fill="EAF1FB"/>
+          </w:tcPr>
+          <w:p>
+            <w:r>
+              <w:rPr>
+                <w:sz w:val="16"/>
+                <w:b w:val="0"/>
+              </w:rPr>
+              <w:t xml:space="preserve">Sections 2–3 at a conceptual level (objective, tree boosting, split finding).</w:t>
+            </w:r>
+          </w:p>
+        </w:tc>
+      </w:tr>
+      <w:tr>
+        <w:tc>
+          <w:tcPr>
+            <w:tcW w:type="dxa" w:w="1701"/>
+          </w:tcPr>
+          <w:p>
+            <w:r>
+              <w:rPr>
+                <w:b/>
+                <w:sz w:val="16"/>
+              </w:rPr>
+              <w:t>Can skim / skip</w:t>
+            </w:r>
+          </w:p>
+        </w:tc>
+        <w:tc>
+          <w:tcPr>
+            <w:tcW w:type="dxa" w:w="8164"/>
+          </w:tcPr>
+          <w:p>
+            <w:r>
+              <w:rPr>
+                <w:sz w:val="16"/>
+                <w:b w:val="0"/>
+              </w:rPr>
+              <w:t xml:space="preserve">Systems sections (cache-aware access, out-of-core computation).</w:t>
+            </w:r>
+          </w:p>
+        </w:tc>
+      </w:tr>
+      <w:tr>
+        <w:tc>
+          <w:tcPr>
+            <w:tcW w:type="dxa" w:w="1701"/>
+          </w:tcPr>
+          <w:p>
+            <w:r>
+              <w:rPr>
+                <w:b/>
+                <w:sz w:val="16"/>
+              </w:rPr>
+              <w:t>Key terms</w:t>
+            </w:r>
+          </w:p>
+        </w:tc>
+        <w:tc>
+          <w:tcPr>
+            <w:tcW w:type="dxa" w:w="8164"/>
+          </w:tcPr>
+          <w:p>
+            <w:r>
+              <w:rPr>
+                <w:sz w:val="16"/>
+                <w:b w:val="0"/>
+              </w:rPr>
+              <w:t xml:space="preserve">gradient boosting; learning rate; max_depth; min_child_weight; subsample</w:t>
+            </w:r>
+          </w:p>
+        </w:tc>
+      </w:tr>
+      <w:tr>
+        <w:tc>
+          <w:tcPr>
+            <w:tcW w:type="dxa" w:w="1701"/>
+          </w:tcPr>
+          <w:p>
+            <w:r>
+              <w:rPr>
+                <w:b/>
+                <w:sz w:val="16"/>
+              </w:rPr>
+              <w:t>Strengths</w:t>
+            </w:r>
+          </w:p>
+        </w:tc>
+        <w:tc>
+          <w:tcPr>
+            <w:tcW w:type="dxa" w:w="8164"/>
+          </w:tcPr>
+          <w:p>
+            <w:r>
+              <w:rPr>
+                <w:sz w:val="16"/>
+                <w:b w:val="0"/>
+              </w:rPr>
+              <w:t xml:space="preserve">Strong on tabular data; built-in regularisation.</w:t>
+            </w:r>
+          </w:p>
+        </w:tc>
+      </w:tr>
+      <w:tr>
+        <w:tc>
+          <w:tcPr>
+            <w:tcW w:type="dxa" w:w="1701"/>
+          </w:tcPr>
+          <w:p>
+            <w:r>
+              <w:rPr>
+                <w:b/>
+                <w:sz w:val="16"/>
+              </w:rPr>
+              <w:t>Weaknesses / critique</w:t>
+            </w:r>
+          </w:p>
+        </w:tc>
+        <w:tc>
+          <w:tcPr>
+            <w:tcW w:type="dxa" w:w="8164"/>
+          </w:tcPr>
+          <w:p>
+            <w:r>
+              <w:rPr>
+                <w:sz w:val="16"/>
+                <w:b w:val="0"/>
+              </w:rPr>
+              <w:t xml:space="preserve">Many settings to tune; the tree version cannot extrapolate.</w:t>
+            </w:r>
+          </w:p>
+        </w:tc>
+      </w:tr>
+      <w:tr>
+        <w:tc>
+          <w:tcPr>
+            <w:tcW w:type="dxa" w:w="1701"/>
+            <w:shd w:val="clear" w:color="auto" w:fill="EAF1FB"/>
+          </w:tcPr>
+          <w:p>
+            <w:r>
+              <w:rPr>
+                <w:b/>
+                <w:sz w:val="16"/>
+              </w:rPr>
+              <w:t>Use it as · where</w:t>
+            </w:r>
+          </w:p>
+        </w:tc>
+        <w:tc>
+          <w:tcPr>
+            <w:tcW w:type="dxa" w:w="8164"/>
+            <w:shd w:val="clear" w:color="auto" w:fill="EAF1FB"/>
+          </w:tcPr>
+          <w:p>
+            <w:r>
+              <w:rPr>
+                <w:sz w:val="16"/>
+                <w:b w:val="0"/>
+              </w:rPr>
+              <w:t xml:space="preserve">Method · Chapter 3 (E4)</w:t>
+            </w:r>
+          </w:p>
+        </w:tc>
+      </w:tr>
+    </w:tbl>
+    <w:p>
+      <w:pPr>
+        <w:spacing w:after="80"/>
+      </w:pPr>
+    </w:p>
+    <w:tbl>
+      <w:tblPr>
+        <w:tblStyle w:val="TableGrid"/>
+        <w:tblW w:type="auto" w:w="0"/>
+        <w:jc w:val="center"/>
+        <w:tblLook w:firstColumn="1" w:firstRow="1" w:lastColumn="0" w:lastRow="0" w:noHBand="0" w:noVBand="1" w:val="04A0"/>
+      </w:tblPr>
+      <w:tblGrid>
+        <w:gridCol w:w="5100"/>
+        <w:gridCol w:w="5100"/>
+      </w:tblGrid>
+      <w:tr>
+        <w:tc>
+          <w:tcPr>
+            <w:tcW w:type="dxa" w:w="8164"/>
+            <w:gridSpan w:val="2"/>
+            <w:shd w:val="clear" w:color="auto" w:fill="1F4E79"/>
+          </w:tcPr>
+          <w:p>
+            <w:r>
+              <w:rPr>
+                <w:color w:val="FFFFFF"/>
+                <w:sz w:val="19"/>
+                <w:b/>
+              </w:rPr>
+              <w:t xml:space="preserve">Corsi, F. &amp; Renò, R. (2012) Discrete-time volatility forecasting with persistent leverage effect and the link with continuous-time volatility modeling. Journal of Business &amp; Economic Statistics, 30(3), 368–380.</w:t>
+            </w:r>
+          </w:p>
+        </w:tc>
+      </w:tr>
+      <w:tr>
+        <w:tc>
+          <w:tcPr>
+            <w:tcW w:type="dxa" w:w="1701"/>
+            <w:shd w:val="clear" w:color="auto" w:fill="EFEFEF"/>
+          </w:tcPr>
+          <w:p>
+            <w:r>
+              <w:rPr>
+                <w:b/>
+                <w:sz w:val="16"/>
+              </w:rPr>
+              <w:t>Source basis</w:t>
+            </w:r>
+          </w:p>
+        </w:tc>
+        <w:tc>
+          <w:tcPr>
+            <w:tcW w:type="dxa" w:w="8164"/>
+            <w:shd w:val="clear" w:color="auto" w:fill="EFEFEF"/>
+          </w:tcPr>
+          <w:p>
+            <w:r>
+              <w:rPr>
+                <w:sz w:val="16"/>
+              </w:rPr>
+              <w:t>STANDARD KNOWLEDGE, not re-read this session; confirm every detail and page before citing</w:t>
+            </w:r>
+          </w:p>
+        </w:tc>
+      </w:tr>
+      <w:tr>
+        <w:tc>
+          <w:tcPr>
+            <w:tcW w:type="dxa" w:w="1701"/>
+          </w:tcPr>
+          <w:p>
+            <w:r>
+              <w:rPr>
+                <w:b/>
+                <w:sz w:val="16"/>
+              </w:rPr>
+              <w:t>Summary</w:t>
+            </w:r>
+          </w:p>
+        </w:tc>
+        <w:tc>
+          <w:tcPr>
+            <w:tcW w:type="dxa" w:w="8164"/>
+          </w:tcPr>
+          <w:p>
+            <w:r>
+              <w:rPr>
+                <w:sz w:val="16"/>
+                <w:b w:val="0"/>
+              </w:rPr>
+              <w:t xml:space="preserve">Adds a leverage effect to the HAR model: past negative returns, averaged over a day, a week and a month, raise future volatility; jumps are modelled as well.</w:t>
+            </w:r>
+          </w:p>
+        </w:tc>
+      </w:tr>
+      <w:tr>
+        <w:tc>
+          <w:tcPr>
+            <w:tcW w:type="dxa" w:w="1701"/>
+          </w:tcPr>
+          <w:p>
+            <w:r>
+              <w:rPr>
+                <w:b/>
+                <w:sz w:val="16"/>
+              </w:rPr>
+              <w:t>Dataset</w:t>
+            </w:r>
+          </w:p>
+        </w:tc>
+        <w:tc>
+          <w:tcPr>
+            <w:tcW w:type="dxa" w:w="8164"/>
+          </w:tcPr>
+          <w:p>
+            <w:r>
+              <w:rPr>
+                <w:sz w:val="16"/>
+                <w:b w:val="0"/>
+              </w:rPr>
+              <w:t xml:space="preserve">US stock-index futures, high-frequency data (confirm the asset and period).</w:t>
+            </w:r>
+          </w:p>
+        </w:tc>
+      </w:tr>
+      <w:tr>
+        <w:tc>
+          <w:tcPr>
+            <w:tcW w:type="dxa" w:w="1701"/>
+          </w:tcPr>
+          <w:p>
+            <w:r>
+              <w:rPr>
+                <w:b/>
+                <w:sz w:val="16"/>
+              </w:rPr>
+              <w:t>Methodology</w:t>
+            </w:r>
+          </w:p>
+        </w:tc>
+        <w:tc>
+          <w:tcPr>
+            <w:tcW w:type="dxa" w:w="8164"/>
+          </w:tcPr>
+          <w:p>
+            <w:r>
+              <w:rPr>
+                <w:sz w:val="16"/>
+                <w:b w:val="0"/>
+              </w:rPr>
+              <w:t xml:space="preserve">HAR regression with negative-return terms min(r, 0) at three horizons, plus jump terms; link to continuous-time models.</w:t>
+            </w:r>
+          </w:p>
+        </w:tc>
+      </w:tr>
+      <w:tr>
+        <w:tc>
+          <w:tcPr>
+            <w:tcW w:type="dxa" w:w="1701"/>
+          </w:tcPr>
+          <w:p>
+            <w:r>
+              <w:rPr>
+                <w:b/>
+                <w:sz w:val="16"/>
+              </w:rPr>
+              <w:t>Results</w:t>
+            </w:r>
+          </w:p>
+        </w:tc>
+        <w:tc>
+          <w:tcPr>
+            <w:tcW w:type="dxa" w:w="8164"/>
+          </w:tcPr>
+          <w:p>
+            <w:r>
+              <w:rPr>
+                <w:sz w:val="16"/>
+                <w:b w:val="0"/>
+              </w:rPr>
+              <w:t xml:space="preserve">• Leverage is persistent: falls raise volatility for weeks, not only the next day.</w:t>
+            </w:r>
+          </w:p>
+          <w:p>
+            <w:r>
+              <w:rPr>
+                <w:sz w:val="16"/>
+                <w:b w:val="0"/>
+              </w:rPr>
+              <w:t xml:space="preserve">• Leverage and jump terms improve forecasts.</w:t>
+            </w:r>
+          </w:p>
+        </w:tc>
+      </w:tr>
+      <w:tr>
+        <w:tc>
+          <w:tcPr>
+            <w:tcW w:type="dxa" w:w="1701"/>
+            <w:shd w:val="clear" w:color="auto" w:fill="EAF1FB"/>
+          </w:tcPr>
+          <w:p>
+            <w:r>
+              <w:rPr>
+                <w:b/>
+                <w:sz w:val="16"/>
+              </w:rPr>
+              <w:t>How it relates to MY study</w:t>
+            </w:r>
+          </w:p>
+        </w:tc>
+        <w:tc>
+          <w:tcPr>
+            <w:tcW w:type="dxa" w:w="8164"/>
+            <w:shd w:val="clear" w:color="auto" w:fill="EAF1FB"/>
+          </w:tcPr>
+          <w:p>
+            <w:r>
+              <w:rPr>
+                <w:sz w:val="16"/>
+                <w:b w:val="0"/>
+              </w:rPr>
+              <w:t xml:space="preserve">Source of the leverage terms in your E4. In your HAR-X they entered a log model linearly, and in October 2008 the forecasts exploded (up to 9,955 × 10⁻⁴) — a specification point for your discussion.</w:t>
+            </w:r>
+          </w:p>
+        </w:tc>
+      </w:tr>
+      <w:tr>
+        <w:tc>
+          <w:tcPr>
+            <w:tcW w:type="dxa" w:w="1701"/>
+            <w:shd w:val="clear" w:color="auto" w:fill="EAF1FB"/>
+          </w:tcPr>
+          <w:p>
+            <w:r>
+              <w:rPr>
+                <w:b/>
+                <w:sz w:val="16"/>
+              </w:rPr>
+              <w:t>Must read in the original</w:t>
+            </w:r>
+          </w:p>
+        </w:tc>
+        <w:tc>
+          <w:tcPr>
+            <w:tcW w:type="dxa" w:w="8164"/>
+            <w:shd w:val="clear" w:color="auto" w:fill="EAF1FB"/>
+          </w:tcPr>
+          <w:p>
+            <w:r>
+              <w:rPr>
+                <w:sz w:val="16"/>
+                <w:b w:val="0"/>
+              </w:rPr>
+              <w:t xml:space="preserve">The model specification and the forecasting results.</w:t>
+            </w:r>
+          </w:p>
+        </w:tc>
+      </w:tr>
+      <w:tr>
+        <w:tc>
+          <w:tcPr>
+            <w:tcW w:type="dxa" w:w="1701"/>
+          </w:tcPr>
+          <w:p>
+            <w:r>
+              <w:rPr>
+                <w:b/>
+                <w:sz w:val="16"/>
+              </w:rPr>
+              <w:t>Can skim / skip</w:t>
+            </w:r>
+          </w:p>
+        </w:tc>
+        <w:tc>
+          <w:tcPr>
+            <w:tcW w:type="dxa" w:w="8164"/>
+          </w:tcPr>
+          <w:p>
+            <w:r>
+              <w:rPr>
+                <w:sz w:val="16"/>
+                <w:b w:val="0"/>
+              </w:rPr>
+              <w:t xml:space="preserve">Continuous-time derivations.</w:t>
+            </w:r>
+          </w:p>
+        </w:tc>
+      </w:tr>
+      <w:tr>
+        <w:tc>
+          <w:tcPr>
+            <w:tcW w:type="dxa" w:w="1701"/>
+          </w:tcPr>
+          <w:p>
+            <w:r>
+              <w:rPr>
+                <w:b/>
+                <w:sz w:val="16"/>
+              </w:rPr>
+              <w:t>Key terms</w:t>
+            </w:r>
+          </w:p>
+        </w:tc>
+        <w:tc>
+          <w:tcPr>
+            <w:tcW w:type="dxa" w:w="8164"/>
+          </w:tcPr>
+          <w:p>
+            <w:r>
+              <w:rPr>
+                <w:sz w:val="16"/>
+                <w:b w:val="0"/>
+              </w:rPr>
+              <w:t xml:space="preserve">leverage effect; LHAR; jumps; heterogeneous horizons</w:t>
+            </w:r>
+          </w:p>
+        </w:tc>
+      </w:tr>
+      <w:tr>
+        <w:tc>
+          <w:tcPr>
+            <w:tcW w:type="dxa" w:w="1701"/>
+          </w:tcPr>
+          <w:p>
+            <w:r>
+              <w:rPr>
+                <w:b/>
+                <w:sz w:val="16"/>
+              </w:rPr>
+              <w:t>Strengths</w:t>
+            </w:r>
+          </w:p>
+        </w:tc>
+        <w:tc>
+          <w:tcPr>
+            <w:tcW w:type="dxa" w:w="8164"/>
+          </w:tcPr>
+          <w:p>
+            <w:r>
+              <w:rPr>
+                <w:sz w:val="16"/>
+                <w:b w:val="0"/>
+              </w:rPr>
+              <w:t xml:space="preserve">Simple extension of HAR; strong empirical support.</w:t>
+            </w:r>
+          </w:p>
+        </w:tc>
+      </w:tr>
+      <w:tr>
+        <w:tc>
+          <w:tcPr>
+            <w:tcW w:type="dxa" w:w="1701"/>
+          </w:tcPr>
+          <w:p>
+            <w:r>
+              <w:rPr>
+                <w:b/>
+                <w:sz w:val="16"/>
+              </w:rPr>
+              <w:t>Weaknesses / critique</w:t>
+            </w:r>
+          </w:p>
+        </w:tc>
+        <w:tc>
+          <w:tcPr>
+            <w:tcW w:type="dxa" w:w="8164"/>
+          </w:tcPr>
+          <w:p>
+            <w:r>
+              <w:rPr>
+                <w:sz w:val="16"/>
+                <w:b w:val="0"/>
+              </w:rPr>
+              <w:t xml:space="preserve">Linear leverage terms in a log model can explode in an unprecedented crash (your E4).</w:t>
+            </w:r>
+          </w:p>
+        </w:tc>
+      </w:tr>
+      <w:tr>
+        <w:tc>
+          <w:tcPr>
+            <w:tcW w:type="dxa" w:w="1701"/>
+            <w:shd w:val="clear" w:color="auto" w:fill="EAF1FB"/>
+          </w:tcPr>
+          <w:p>
+            <w:r>
+              <w:rPr>
+                <w:b/>
+                <w:sz w:val="16"/>
+              </w:rPr>
+              <w:t>Use it as · where</w:t>
+            </w:r>
+          </w:p>
+        </w:tc>
+        <w:tc>
+          <w:tcPr>
+            <w:tcW w:type="dxa" w:w="8164"/>
+            <w:shd w:val="clear" w:color="auto" w:fill="EAF1FB"/>
+          </w:tcPr>
+          <w:p>
+            <w:r>
+              <w:rPr>
+                <w:sz w:val="16"/>
+                <w:b w:val="0"/>
+              </w:rPr>
+              <w:t xml:space="preserve">Method · Chapter 3 (E4); Discussion</w:t>
+            </w:r>
+          </w:p>
+        </w:tc>
+      </w:tr>
+    </w:tbl>
+    <w:p>
+      <w:pPr>
+        <w:spacing w:after="80"/>
+      </w:pPr>
+    </w:p>
+    <w:tbl>
+      <w:tblPr>
+        <w:tblStyle w:val="TableGrid"/>
+        <w:tblW w:type="auto" w:w="0"/>
+        <w:jc w:val="center"/>
+        <w:tblLook w:firstColumn="1" w:firstRow="1" w:lastColumn="0" w:lastRow="0" w:noHBand="0" w:noVBand="1" w:val="04A0"/>
+      </w:tblPr>
+      <w:tblGrid>
+        <w:gridCol w:w="5100"/>
+        <w:gridCol w:w="5100"/>
+      </w:tblGrid>
+      <w:tr>
+        <w:tc>
+          <w:tcPr>
+            <w:tcW w:type="dxa" w:w="8164"/>
+            <w:gridSpan w:val="2"/>
+            <w:shd w:val="clear" w:color="auto" w:fill="1F4E79"/>
+          </w:tcPr>
+          <w:p>
+            <w:r>
+              <w:rPr>
+                <w:color w:val="FFFFFF"/>
+                <w:sz w:val="19"/>
+                <w:b/>
+              </w:rPr>
+              <w:t xml:space="preserve">Audrino, F. &amp; Knaus, S.D. (2016) Lassoing the HAR model: a model selection perspective on realized volatility dynamics. Econometric Reviews, 35(8–10), 1485–1521.</w:t>
+            </w:r>
+          </w:p>
+        </w:tc>
+      </w:tr>
+      <w:tr>
+        <w:tc>
+          <w:tcPr>
+            <w:tcW w:type="dxa" w:w="1701"/>
+            <w:shd w:val="clear" w:color="auto" w:fill="FFF2CC"/>
+          </w:tcPr>
+          <w:p>
+            <w:r>
+              <w:rPr>
+                <w:b/>
+                <w:sz w:val="16"/>
+              </w:rPr>
+              <w:t>Source basis</w:t>
+            </w:r>
+          </w:p>
+        </w:tc>
+        <w:tc>
+          <w:tcPr>
+            <w:tcW w:type="dxa" w:w="8164"/>
+            <w:shd w:val="clear" w:color="auto" w:fill="FFF2CC"/>
+          </w:tcPr>
+          <w:p>
+            <w:r>
+              <w:rPr>
+                <w:sz w:val="16"/>
+              </w:rPr>
+              <w:t>ABSTRACT / summary read in this session; read the full paper before relying on details</w:t>
+            </w:r>
+          </w:p>
+        </w:tc>
+      </w:tr>
+      <w:tr>
+        <w:tc>
+          <w:tcPr>
+            <w:tcW w:type="dxa" w:w="1701"/>
+          </w:tcPr>
+          <w:p>
+            <w:r>
+              <w:rPr>
+                <w:b/>
+                <w:sz w:val="16"/>
+              </w:rPr>
+              <w:t>Summary</w:t>
+            </w:r>
+          </w:p>
+        </w:tc>
+        <w:tc>
+          <w:tcPr>
+            <w:tcW w:type="dxa" w:w="8164"/>
+          </w:tcPr>
+          <w:p>
+            <w:r>
+              <w:rPr>
+                <w:sz w:val="16"/>
+                <w:b w:val="0"/>
+              </w:rPr>
+              <w:t xml:space="preserve">Lets the lasso choose which past volatility lags matter, and asks whether it recovers the HAR structure.</w:t>
+            </w:r>
+          </w:p>
+        </w:tc>
+      </w:tr>
+      <w:tr>
+        <w:tc>
+          <w:tcPr>
+            <w:tcW w:type="dxa" w:w="1701"/>
+          </w:tcPr>
+          <w:p>
+            <w:r>
+              <w:rPr>
+                <w:b/>
+                <w:sz w:val="16"/>
+              </w:rPr>
+              <w:t>Dataset</w:t>
+            </w:r>
+          </w:p>
+        </w:tc>
+        <w:tc>
+          <w:tcPr>
+            <w:tcW w:type="dxa" w:w="8164"/>
+          </w:tcPr>
+          <w:p>
+            <w:r>
+              <w:rPr>
+                <w:sz w:val="16"/>
+                <w:b w:val="0"/>
+              </w:rPr>
+              <w:t xml:space="preserve">Realised volatility series (confirm the assets and period in the paper).</w:t>
+            </w:r>
+          </w:p>
+        </w:tc>
+      </w:tr>
+      <w:tr>
+        <w:tc>
+          <w:tcPr>
+            <w:tcW w:type="dxa" w:w="1701"/>
+          </w:tcPr>
+          <w:p>
+            <w:r>
+              <w:rPr>
+                <w:b/>
+                <w:sz w:val="16"/>
+              </w:rPr>
+              <w:t>Methodology</w:t>
+            </w:r>
+          </w:p>
+        </w:tc>
+        <w:tc>
+          <w:tcPr>
+            <w:tcW w:type="dxa" w:w="8164"/>
+          </w:tcPr>
+          <w:p>
+            <w:r>
+              <w:rPr>
+                <w:sz w:val="16"/>
+                <w:b w:val="0"/>
+              </w:rPr>
+              <w:t xml:space="preserve">Lasso on many lags of realised volatility; theory for the case where HAR is the true model; out-of-sample comparison with HAR.</w:t>
+            </w:r>
+          </w:p>
+        </w:tc>
+      </w:tr>
+      <w:tr>
+        <w:tc>
+          <w:tcPr>
+            <w:tcW w:type="dxa" w:w="1701"/>
+          </w:tcPr>
+          <w:p>
+            <w:r>
+              <w:rPr>
+                <w:b/>
+                <w:sz w:val="16"/>
+              </w:rPr>
+              <w:t>Results</w:t>
+            </w:r>
+          </w:p>
+        </w:tc>
+        <w:tc>
+          <w:tcPr>
+            <w:tcW w:type="dxa" w:w="8164"/>
+          </w:tcPr>
+          <w:p>
+            <w:r>
+              <w:rPr>
+                <w:sz w:val="16"/>
+                <w:b w:val="0"/>
+              </w:rPr>
+              <w:t xml:space="preserve">• If HAR is the true model, the lasso recovers its lag structure in large samples.</w:t>
+            </w:r>
+          </w:p>
+          <w:p>
+            <w:r>
+              <w:rPr>
+                <w:sz w:val="16"/>
+                <w:b w:val="0"/>
+              </w:rPr>
+              <w:t xml:space="preserve">• In the data the lasso picks a different lag structure from HAR, yet forecasts about as well.</w:t>
+            </w:r>
+          </w:p>
+        </w:tc>
+      </w:tr>
+      <w:tr>
+        <w:tc>
+          <w:tcPr>
+            <w:tcW w:type="dxa" w:w="1701"/>
+            <w:shd w:val="clear" w:color="auto" w:fill="EAF1FB"/>
+          </w:tcPr>
+          <w:p>
+            <w:r>
+              <w:rPr>
+                <w:b/>
+                <w:sz w:val="16"/>
+              </w:rPr>
+              <w:t>How it relates to MY study</w:t>
+            </w:r>
+          </w:p>
+        </w:tc>
+        <w:tc>
+          <w:tcPr>
+            <w:tcW w:type="dxa" w:w="8164"/>
+            <w:shd w:val="clear" w:color="auto" w:fill="EAF1FB"/>
+          </w:tcPr>
+          <w:p>
+            <w:r>
+              <w:rPr>
+                <w:sz w:val="16"/>
+                <w:b w:val="0"/>
+              </w:rPr>
+              <w:t xml:space="preserve">Linear machine learning (penalised regression) does no better than HAR — support for reading your HAR and GARCH results as hard to beat. A LASSO-HAR with many lags is a possible PhD extension.</w:t>
+            </w:r>
+          </w:p>
+        </w:tc>
+      </w:tr>
+      <w:tr>
+        <w:tc>
+          <w:tcPr>
+            <w:tcW w:type="dxa" w:w="1701"/>
+            <w:shd w:val="clear" w:color="auto" w:fill="EAF1FB"/>
+          </w:tcPr>
+          <w:p>
+            <w:r>
+              <w:rPr>
+                <w:b/>
+                <w:sz w:val="16"/>
+              </w:rPr>
+              <w:t>Must read in the original</w:t>
+            </w:r>
+          </w:p>
+        </w:tc>
+        <w:tc>
+          <w:tcPr>
+            <w:tcW w:type="dxa" w:w="8164"/>
+            <w:shd w:val="clear" w:color="auto" w:fill="EAF1FB"/>
+          </w:tcPr>
+          <w:p>
+            <w:r>
+              <w:rPr>
+                <w:sz w:val="16"/>
+                <w:b w:val="0"/>
+              </w:rPr>
+              <w:t xml:space="preserve">Introduction, empirical section and conclusion.</w:t>
+            </w:r>
+          </w:p>
+        </w:tc>
+      </w:tr>
+      <w:tr>
+        <w:tc>
+          <w:tcPr>
+            <w:tcW w:type="dxa" w:w="1701"/>
+          </w:tcPr>
+          <w:p>
+            <w:r>
+              <w:rPr>
+                <w:b/>
+                <w:sz w:val="16"/>
+              </w:rPr>
+              <w:t>Can skim / skip</w:t>
+            </w:r>
+          </w:p>
+        </w:tc>
+        <w:tc>
+          <w:tcPr>
+            <w:tcW w:type="dxa" w:w="8164"/>
+          </w:tcPr>
+          <w:p>
+            <w:r>
+              <w:rPr>
+                <w:sz w:val="16"/>
+                <w:b w:val="0"/>
+              </w:rPr>
+              <w:t xml:space="preserve">Proofs.</w:t>
+            </w:r>
+          </w:p>
+        </w:tc>
+      </w:tr>
+      <w:tr>
+        <w:tc>
+          <w:tcPr>
+            <w:tcW w:type="dxa" w:w="1701"/>
+          </w:tcPr>
+          <w:p>
+            <w:r>
+              <w:rPr>
+                <w:b/>
+                <w:sz w:val="16"/>
+              </w:rPr>
+              <w:t>Key terms</w:t>
+            </w:r>
+          </w:p>
+        </w:tc>
+        <w:tc>
+          <w:tcPr>
+            <w:tcW w:type="dxa" w:w="8164"/>
+          </w:tcPr>
+          <w:p>
+            <w:r>
+              <w:rPr>
+                <w:sz w:val="16"/>
+                <w:b w:val="0"/>
+              </w:rPr>
+              <w:t xml:space="preserve">lasso; lag selection; sparsity; HAR</w:t>
+            </w:r>
+          </w:p>
+        </w:tc>
+      </w:tr>
+      <w:tr>
+        <w:tc>
+          <w:tcPr>
+            <w:tcW w:type="dxa" w:w="1701"/>
+          </w:tcPr>
+          <w:p>
+            <w:r>
+              <w:rPr>
+                <w:b/>
+                <w:sz w:val="16"/>
+              </w:rPr>
+              <w:t>Strengths</w:t>
+            </w:r>
+          </w:p>
+        </w:tc>
+        <w:tc>
+          <w:tcPr>
+            <w:tcW w:type="dxa" w:w="8164"/>
+          </w:tcPr>
+          <w:p>
+            <w:r>
+              <w:rPr>
+                <w:sz w:val="16"/>
+                <w:b w:val="0"/>
+              </w:rPr>
+              <w:t xml:space="preserve">Combines theory and data.</w:t>
+            </w:r>
+          </w:p>
+        </w:tc>
+      </w:tr>
+      <w:tr>
+        <w:tc>
+          <w:tcPr>
+            <w:tcW w:type="dxa" w:w="1701"/>
+          </w:tcPr>
+          <w:p>
+            <w:r>
+              <w:rPr>
+                <w:b/>
+                <w:sz w:val="16"/>
+              </w:rPr>
+              <w:t>Weaknesses / critique</w:t>
+            </w:r>
+          </w:p>
+        </w:tc>
+        <w:tc>
+          <w:tcPr>
+            <w:tcW w:type="dxa" w:w="8164"/>
+          </w:tcPr>
+          <w:p>
+            <w:r>
+              <w:rPr>
+                <w:sz w:val="16"/>
+                <w:b w:val="0"/>
+              </w:rPr>
+              <w:t xml:space="preserve">Only the abstract was read; linear models only.</w:t>
+            </w:r>
+          </w:p>
+        </w:tc>
+      </w:tr>
+      <w:tr>
+        <w:tc>
+          <w:tcPr>
+            <w:tcW w:type="dxa" w:w="1701"/>
+            <w:shd w:val="clear" w:color="auto" w:fill="EAF1FB"/>
+          </w:tcPr>
+          <w:p>
+            <w:r>
+              <w:rPr>
+                <w:b/>
+                <w:sz w:val="16"/>
+              </w:rPr>
+              <w:t>Use it as · where</w:t>
+            </w:r>
+          </w:p>
+        </w:tc>
+        <w:tc>
+          <w:tcPr>
+            <w:tcW w:type="dxa" w:w="8164"/>
+            <w:shd w:val="clear" w:color="auto" w:fill="EAF1FB"/>
+          </w:tcPr>
+          <w:p>
+            <w:r>
+              <w:rPr>
+                <w:sz w:val="16"/>
+                <w:b w:val="0"/>
+              </w:rPr>
+              <w:t xml:space="preserve">Evidence · 2.5</w:t>
+            </w:r>
+          </w:p>
+        </w:tc>
+      </w:tr>
+    </w:tbl>
+    <w:p>
+      <w:pPr>
+        <w:spacing w:after="80"/>
+      </w:pPr>
+    </w:p>
+    <w:tbl>
+      <w:tblPr>
+        <w:tblStyle w:val="TableGrid"/>
+        <w:tblW w:type="auto" w:w="0"/>
+        <w:jc w:val="center"/>
+        <w:tblLook w:firstColumn="1" w:firstRow="1" w:lastColumn="0" w:lastRow="0" w:noHBand="0" w:noVBand="1" w:val="04A0"/>
+      </w:tblPr>
+      <w:tblGrid>
+        <w:gridCol w:w="5100"/>
+        <w:gridCol w:w="5100"/>
+      </w:tblGrid>
+      <w:tr>
+        <w:tc>
+          <w:tcPr>
+            <w:tcW w:type="dxa" w:w="8164"/>
+            <w:gridSpan w:val="2"/>
+            <w:shd w:val="clear" w:color="auto" w:fill="1F4E79"/>
+          </w:tcPr>
+          <w:p>
+            <w:r>
+              <w:rPr>
+                <w:color w:val="FFFFFF"/>
+                <w:sz w:val="19"/>
+                <w:b/>
+              </w:rPr>
+              <w:t xml:space="preserve">Branco, R.R., Rubesam, A. &amp; Zevallos, M. (2024) Forecasting realized volatility: does anything beat linear models? Journal of Empirical Finance, 78, 101524.</w:t>
+            </w:r>
+          </w:p>
+        </w:tc>
+      </w:tr>
+      <w:tr>
+        <w:tc>
+          <w:tcPr>
+            <w:tcW w:type="dxa" w:w="1701"/>
+            <w:shd w:val="clear" w:color="auto" w:fill="FFF2CC"/>
+          </w:tcPr>
+          <w:p>
+            <w:r>
+              <w:rPr>
+                <w:b/>
+                <w:sz w:val="16"/>
+              </w:rPr>
+              <w:t>Source basis</w:t>
+            </w:r>
+          </w:p>
+        </w:tc>
+        <w:tc>
+          <w:tcPr>
+            <w:tcW w:type="dxa" w:w="8164"/>
+            <w:shd w:val="clear" w:color="auto" w:fill="FFF2CC"/>
+          </w:tcPr>
+          <w:p>
+            <w:r>
+              <w:rPr>
+                <w:sz w:val="16"/>
+              </w:rPr>
+              <w:t>ABSTRACT / summary read in this session; read the full paper before relying on details</w:t>
+            </w:r>
+          </w:p>
+        </w:tc>
+      </w:tr>
+      <w:tr>
+        <w:tc>
+          <w:tcPr>
+            <w:tcW w:type="dxa" w:w="1701"/>
+          </w:tcPr>
+          <w:p>
+            <w:r>
+              <w:rPr>
+                <w:b/>
+                <w:sz w:val="16"/>
+              </w:rPr>
+              <w:t>Summary</w:t>
+            </w:r>
+          </w:p>
+        </w:tc>
+        <w:tc>
+          <w:tcPr>
+            <w:tcW w:type="dxa" w:w="8164"/>
+          </w:tcPr>
+          <w:p>
+            <w:r>
+              <w:rPr>
+                <w:sz w:val="16"/>
+                <w:b w:val="0"/>
+              </w:rPr>
+              <w:t xml:space="preserve">Compares linear models (HAR family and penalised regressions) with non-linear machine-learning models for forecasting the realised volatility of ten stock indices.</w:t>
+            </w:r>
+          </w:p>
+        </w:tc>
+      </w:tr>
+      <w:tr>
+        <w:tc>
+          <w:tcPr>
+            <w:tcW w:type="dxa" w:w="1701"/>
+          </w:tcPr>
+          <w:p>
+            <w:r>
+              <w:rPr>
+                <w:b/>
+                <w:sz w:val="16"/>
+              </w:rPr>
+              <w:t>Dataset</w:t>
+            </w:r>
+          </w:p>
+        </w:tc>
+        <w:tc>
+          <w:tcPr>
+            <w:tcW w:type="dxa" w:w="8164"/>
+          </w:tcPr>
+          <w:p>
+            <w:r>
+              <w:rPr>
+                <w:sz w:val="16"/>
+                <w:b w:val="0"/>
+              </w:rPr>
+              <w:t xml:space="preserve">Ten global stock-market indices, January 2000 – December 2021. Predictors: past realised volatility, lagged returns, implied volatility, macroeconomic and sentiment variables.</w:t>
+            </w:r>
+          </w:p>
+        </w:tc>
+      </w:tr>
+      <w:tr>
+        <w:tc>
+          <w:tcPr>
+            <w:tcW w:type="dxa" w:w="1701"/>
+          </w:tcPr>
+          <w:p>
+            <w:r>
+              <w:rPr>
+                <w:b/>
+                <w:sz w:val="16"/>
+              </w:rPr>
+              <w:t>Methodology</w:t>
+            </w:r>
+          </w:p>
+        </w:tc>
+        <w:tc>
+          <w:tcPr>
+            <w:tcW w:type="dxa" w:w="8164"/>
+          </w:tcPr>
+          <w:p>
+            <w:r>
+              <w:rPr>
+                <w:sz w:val="16"/>
+                <w:b w:val="0"/>
+              </w:rPr>
+              <w:t xml:space="preserve">Out-of-sample forecasts at daily, weekly and monthly horizons; MSE and Value-at-Risk evaluation; Model Confidence Set; volatility-timing portfolios for economic value.</w:t>
+            </w:r>
+          </w:p>
+        </w:tc>
+      </w:tr>
+      <w:tr>
+        <w:tc>
+          <w:tcPr>
+            <w:tcW w:type="dxa" w:w="1701"/>
+          </w:tcPr>
+          <w:p>
+            <w:r>
+              <w:rPr>
+                <w:b/>
+                <w:sz w:val="16"/>
+              </w:rPr>
+              <w:t>Results</w:t>
+            </w:r>
+          </w:p>
+        </w:tc>
+        <w:tc>
+          <w:tcPr>
+            <w:tcW w:type="dxa" w:w="8164"/>
+          </w:tcPr>
+          <w:p>
+            <w:r>
+              <w:rPr>
+                <w:sz w:val="16"/>
+                <w:b w:val="0"/>
+              </w:rPr>
+              <w:t xml:space="preserve">• Extra predictors improve daily and weekly forecasts.</w:t>
+            </w:r>
+          </w:p>
+          <w:p>
+            <w:r>
+              <w:rPr>
+                <w:sz w:val="16"/>
+                <w:b w:val="0"/>
+              </w:rPr>
+              <w:t xml:space="preserve">• No evidence that non-linear ML beats linear models in general.</w:t>
+            </w:r>
+          </w:p>
+          <w:p>
+            <w:r>
+              <w:rPr>
+                <w:sz w:val="16"/>
+                <w:b w:val="0"/>
+              </w:rPr>
+              <w:t xml:space="preserve">• All ML models tend to under-forecast in high-volatility periods and over-forecast in calm ones.</w:t>
+            </w:r>
+          </w:p>
+          <w:p>
+            <w:r>
+              <w:rPr>
+                <w:sz w:val="16"/>
+                <w:b w:val="0"/>
+              </w:rPr>
+              <w:t xml:space="preserve">• Simpler models give more economic value in monthly volatility-timing portfolios.</w:t>
+            </w:r>
+          </w:p>
+        </w:tc>
+      </w:tr>
+      <w:tr>
+        <w:tc>
+          <w:tcPr>
+            <w:tcW w:type="dxa" w:w="1701"/>
+            <w:shd w:val="clear" w:color="auto" w:fill="EAF1FB"/>
+          </w:tcPr>
+          <w:p>
+            <w:r>
+              <w:rPr>
+                <w:b/>
+                <w:sz w:val="16"/>
+              </w:rPr>
+              <w:t>How it relates to MY study</w:t>
+            </w:r>
+          </w:p>
+        </w:tc>
+        <w:tc>
+          <w:tcPr>
+            <w:tcW w:type="dxa" w:w="8164"/>
+            <w:shd w:val="clear" w:color="auto" w:fill="EAF1FB"/>
+          </w:tcPr>
+          <w:p>
+            <w:r>
+              <w:rPr>
+                <w:sz w:val="16"/>
+                <w:b w:val="0"/>
+              </w:rPr>
+              <w:t xml:space="preserve">The closest large-sample match to your E3–E4: non-linear learners do not beat linear benchmarks, and they under-forecast when volatility is high (your learners under-forecast on 69% of GFC days). Implied volatility helps, as in your HAR-X with the VIX.</w:t>
+            </w:r>
+          </w:p>
+        </w:tc>
+      </w:tr>
+      <w:tr>
+        <w:tc>
+          <w:tcPr>
+            <w:tcW w:type="dxa" w:w="1701"/>
+            <w:shd w:val="clear" w:color="auto" w:fill="EAF1FB"/>
+          </w:tcPr>
+          <w:p>
+            <w:r>
+              <w:rPr>
+                <w:b/>
+                <w:sz w:val="16"/>
+              </w:rPr>
+              <w:t>Must read in the original</w:t>
+            </w:r>
+          </w:p>
+        </w:tc>
+        <w:tc>
+          <w:tcPr>
+            <w:tcW w:type="dxa" w:w="8164"/>
+            <w:shd w:val="clear" w:color="auto" w:fill="EAF1FB"/>
+          </w:tcPr>
+          <w:p>
+            <w:r>
+              <w:rPr>
+                <w:sz w:val="16"/>
+                <w:b w:val="0"/>
+              </w:rPr>
+              <w:t xml:space="preserve">Data and model list; main results tables; the high- vs low-volatility analysis (full text via the DBS library).</w:t>
+            </w:r>
+          </w:p>
+        </w:tc>
+      </w:tr>
+      <w:tr>
+        <w:tc>
+          <w:tcPr>
+            <w:tcW w:type="dxa" w:w="1701"/>
+          </w:tcPr>
+          <w:p>
+            <w:r>
+              <w:rPr>
+                <w:b/>
+                <w:sz w:val="16"/>
+              </w:rPr>
+              <w:t>Can skim / skip</w:t>
+            </w:r>
+          </w:p>
+        </w:tc>
+        <w:tc>
+          <w:tcPr>
+            <w:tcW w:type="dxa" w:w="8164"/>
+          </w:tcPr>
+          <w:p>
+            <w:r>
+              <w:rPr>
+                <w:sz w:val="16"/>
+                <w:b w:val="0"/>
+              </w:rPr>
+              <w:t xml:space="preserve">Descriptions of the individual ML algorithms.</w:t>
+            </w:r>
+          </w:p>
+        </w:tc>
+      </w:tr>
+      <w:tr>
+        <w:tc>
+          <w:tcPr>
+            <w:tcW w:type="dxa" w:w="1701"/>
+          </w:tcPr>
+          <w:p>
+            <w:r>
+              <w:rPr>
+                <w:b/>
+                <w:sz w:val="16"/>
+              </w:rPr>
+              <w:t>Key terms</w:t>
+            </w:r>
+          </w:p>
+        </w:tc>
+        <w:tc>
+          <w:tcPr>
+            <w:tcW w:type="dxa" w:w="8164"/>
+          </w:tcPr>
+          <w:p>
+            <w:r>
+              <w:rPr>
+                <w:sz w:val="16"/>
+                <w:b w:val="0"/>
+              </w:rPr>
+              <w:t xml:space="preserve">HARX; Model Confidence Set; volatility timing; implied volatility</w:t>
+            </w:r>
+          </w:p>
+        </w:tc>
+      </w:tr>
+      <w:tr>
+        <w:tc>
+          <w:tcPr>
+            <w:tcW w:type="dxa" w:w="1701"/>
+          </w:tcPr>
+          <w:p>
+            <w:r>
+              <w:rPr>
+                <w:b/>
+                <w:sz w:val="16"/>
+              </w:rPr>
+              <w:t>Strengths</w:t>
+            </w:r>
+          </w:p>
+        </w:tc>
+        <w:tc>
+          <w:tcPr>
+            <w:tcW w:type="dxa" w:w="8164"/>
+          </w:tcPr>
+          <w:p>
+            <w:r>
+              <w:rPr>
+                <w:sz w:val="16"/>
+                <w:b w:val="0"/>
+              </w:rPr>
+              <w:t xml:space="preserve">Ten indices over 22 years; many models; statistical and economic evaluation.</w:t>
+            </w:r>
+          </w:p>
+        </w:tc>
+      </w:tr>
+      <w:tr>
+        <w:tc>
+          <w:tcPr>
+            <w:tcW w:type="dxa" w:w="1701"/>
+          </w:tcPr>
+          <w:p>
+            <w:r>
+              <w:rPr>
+                <w:b/>
+                <w:sz w:val="16"/>
+              </w:rPr>
+              <w:t>Weaknesses / critique</w:t>
+            </w:r>
+          </w:p>
+        </w:tc>
+        <w:tc>
+          <w:tcPr>
+            <w:tcW w:type="dxa" w:w="8164"/>
+          </w:tcPr>
+          <w:p>
+            <w:r>
+              <w:rPr>
+                <w:sz w:val="16"/>
+                <w:b w:val="0"/>
+              </w:rPr>
+              <w:t xml:space="preserve">Only the abstract was read (working-paper and journal versions); check whether crises are analysed separately.</w:t>
+            </w:r>
+          </w:p>
+        </w:tc>
+      </w:tr>
+      <w:tr>
+        <w:tc>
+          <w:tcPr>
+            <w:tcW w:type="dxa" w:w="1701"/>
+            <w:shd w:val="clear" w:color="auto" w:fill="EAF1FB"/>
+          </w:tcPr>
+          <w:p>
+            <w:r>
+              <w:rPr>
+                <w:b/>
+                <w:sz w:val="16"/>
+              </w:rPr>
+              <w:t>Use it as · where</w:t>
+            </w:r>
+          </w:p>
+        </w:tc>
+        <w:tc>
+          <w:tcPr>
+            <w:tcW w:type="dxa" w:w="8164"/>
+            <w:shd w:val="clear" w:color="auto" w:fill="EAF1FB"/>
+          </w:tcPr>
+          <w:p>
+            <w:r>
+              <w:rPr>
+                <w:sz w:val="16"/>
+                <w:b w:val="0"/>
+              </w:rPr>
+              <w:t xml:space="preserve">Evidence · 2.5; Discussion of H1, E3 and E4 (must cite)</w:t>
+            </w:r>
+          </w:p>
+        </w:tc>
+      </w:tr>
+    </w:tbl>
+    <w:p>
+      <w:pPr>
+        <w:spacing w:after="80"/>
+      </w:pPr>
+    </w:p>
+    <w:tbl>
+      <w:tblPr>
+        <w:tblStyle w:val="TableGrid"/>
+        <w:tblW w:type="auto" w:w="0"/>
+        <w:jc w:val="center"/>
+        <w:tblLook w:firstColumn="1" w:firstRow="1" w:lastColumn="0" w:lastRow="0" w:noHBand="0" w:noVBand="1" w:val="04A0"/>
+      </w:tblPr>
+      <w:tblGrid>
+        <w:gridCol w:w="5100"/>
+        <w:gridCol w:w="5100"/>
+      </w:tblGrid>
+      <w:tr>
+        <w:tc>
+          <w:tcPr>
+            <w:tcW w:type="dxa" w:w="8164"/>
+            <w:gridSpan w:val="2"/>
+            <w:shd w:val="clear" w:color="auto" w:fill="1F4E79"/>
+          </w:tcPr>
+          <w:p>
+            <w:r>
+              <w:rPr>
+                <w:color w:val="FFFFFF"/>
+                <w:sz w:val="19"/>
+                <w:b/>
+              </w:rPr>
+              <w:t xml:space="preserve">Audrino, F. &amp; Chassot, J. (2024) HARd to beat: the overlooked impact of rolling windows in the era of machine learning. arXiv 2406.08041 (preprint).</w:t>
+            </w:r>
+          </w:p>
+        </w:tc>
+      </w:tr>
+      <w:tr>
+        <w:tc>
+          <w:tcPr>
+            <w:tcW w:type="dxa" w:w="1701"/>
+            <w:shd w:val="clear" w:color="auto" w:fill="FFF2CC"/>
+          </w:tcPr>
+          <w:p>
+            <w:r>
+              <w:rPr>
+                <w:b/>
+                <w:sz w:val="16"/>
+              </w:rPr>
+              <w:t>Source basis</w:t>
+            </w:r>
+          </w:p>
+        </w:tc>
+        <w:tc>
+          <w:tcPr>
+            <w:tcW w:type="dxa" w:w="8164"/>
+            <w:shd w:val="clear" w:color="auto" w:fill="FFF2CC"/>
+          </w:tcPr>
+          <w:p>
+            <w:r>
+              <w:rPr>
+                <w:sz w:val="16"/>
+              </w:rPr>
+              <w:t>ABSTRACT / summary read in this session; read the full paper before relying on details</w:t>
+            </w:r>
+          </w:p>
+        </w:tc>
+      </w:tr>
+      <w:tr>
+        <w:tc>
+          <w:tcPr>
+            <w:tcW w:type="dxa" w:w="1701"/>
+          </w:tcPr>
+          <w:p>
+            <w:r>
+              <w:rPr>
+                <w:b/>
+                <w:sz w:val="16"/>
+              </w:rPr>
+              <w:t>Summary</w:t>
+            </w:r>
+          </w:p>
+        </w:tc>
+        <w:tc>
+          <w:tcPr>
+            <w:tcW w:type="dxa" w:w="8164"/>
+          </w:tcPr>
+          <w:p>
+            <w:r>
+              <w:rPr>
+                <w:sz w:val="16"/>
+                <w:b w:val="0"/>
+              </w:rPr>
+              <w:t xml:space="preserve">Shows that the length of the training window and how often a model is re-estimated matter more than the choice between HAR and machine learning.</w:t>
+            </w:r>
+          </w:p>
+        </w:tc>
+      </w:tr>
+      <w:tr>
+        <w:tc>
+          <w:tcPr>
+            <w:tcW w:type="dxa" w:w="1701"/>
+          </w:tcPr>
+          <w:p>
+            <w:r>
+              <w:rPr>
+                <w:b/>
+                <w:sz w:val="16"/>
+              </w:rPr>
+              <w:t>Dataset</w:t>
+            </w:r>
+          </w:p>
+        </w:tc>
+        <w:tc>
+          <w:tcPr>
+            <w:tcW w:type="dxa" w:w="8164"/>
+          </w:tcPr>
+          <w:p>
+            <w:r>
+              <w:rPr>
+                <w:sz w:val="16"/>
+                <w:b w:val="0"/>
+              </w:rPr>
+              <w:t xml:space="preserve">1,445 US stocks; daily realised volatility from 5-minute TAQ data; January 2016 – November 2023 (test period January 2022 – November 2023); the VIX as an extra predictor.</w:t>
+            </w:r>
+          </w:p>
+        </w:tc>
+      </w:tr>
+      <w:tr>
+        <w:tc>
+          <w:tcPr>
+            <w:tcW w:type="dxa" w:w="1701"/>
+          </w:tcPr>
+          <w:p>
+            <w:r>
+              <w:rPr>
+                <w:b/>
+                <w:sz w:val="16"/>
+              </w:rPr>
+              <w:t>Methodology</w:t>
+            </w:r>
+          </w:p>
+        </w:tc>
+        <w:tc>
+          <w:tcPr>
+            <w:tcW w:type="dxa" w:w="8164"/>
+          </w:tcPr>
+          <w:p>
+            <w:r>
+              <w:rPr>
+                <w:sz w:val="16"/>
+                <w:b w:val="0"/>
+              </w:rPr>
+              <w:t xml:space="preserve">HAR (including weighted least squares) with rolling windows of 250–2,000 days and re-estimation every 1–250 days, against lasso, random forest, gradient-boosted trees and neural networks; one-day horizon; MSE, QLIKE and realised utility; Model Confidence Set.</w:t>
+            </w:r>
+          </w:p>
+        </w:tc>
+      </w:tr>
+      <w:tr>
+        <w:tc>
+          <w:tcPr>
+            <w:tcW w:type="dxa" w:w="1701"/>
+          </w:tcPr>
+          <w:p>
+            <w:r>
+              <w:rPr>
+                <w:b/>
+                <w:sz w:val="16"/>
+              </w:rPr>
+              <w:t>Results</w:t>
+            </w:r>
+          </w:p>
+        </w:tc>
+        <w:tc>
+          <w:tcPr>
+            <w:tcW w:type="dxa" w:w="8164"/>
+          </w:tcPr>
+          <w:p>
+            <w:r>
+              <w:rPr>
+                <w:sz w:val="16"/>
+                <w:b w:val="0"/>
+              </w:rPr>
+              <w:t xml:space="preserve">• Daily re-estimation matters: accuracy falls even when re-estimating every 2–5 days.</w:t>
+            </w:r>
+          </w:p>
+          <w:p>
+            <w:r>
+              <w:rPr>
+                <w:sz w:val="16"/>
+                <w:b w:val="0"/>
+              </w:rPr>
+              <w:t xml:space="preserve">• HAR estimated by weighted least squares beats every ML model on MSE, QLIKE and utility.</w:t>
+            </w:r>
+          </w:p>
+          <w:p>
+            <w:r>
+              <w:rPr>
+                <w:sz w:val="16"/>
+                <w:b w:val="0"/>
+              </w:rPr>
+              <w:t xml:space="preserve">• Best windows are about 2.5–4 years.</w:t>
+            </w:r>
+          </w:p>
+          <w:p>
+            <w:r>
+              <w:rPr>
+                <w:sz w:val="16"/>
+                <w:b w:val="0"/>
+              </w:rPr>
+              <w:t xml:space="preserve">• Machine learning is 'not a panacea' when the inputs are past volatility and the VIX.</w:t>
+            </w:r>
+          </w:p>
+        </w:tc>
+      </w:tr>
+      <w:tr>
+        <w:tc>
+          <w:tcPr>
+            <w:tcW w:type="dxa" w:w="1701"/>
+            <w:shd w:val="clear" w:color="auto" w:fill="EAF1FB"/>
+          </w:tcPr>
+          <w:p>
+            <w:r>
+              <w:rPr>
+                <w:b/>
+                <w:sz w:val="16"/>
+              </w:rPr>
+              <w:t>How it relates to MY study</w:t>
+            </w:r>
+          </w:p>
+        </w:tc>
+        <w:tc>
+          <w:tcPr>
+            <w:tcW w:type="dxa" w:w="8164"/>
+            <w:shd w:val="clear" w:color="auto" w:fill="EAF1FB"/>
+          </w:tcPr>
+          <w:p>
+            <w:r>
+              <w:rPr>
+                <w:sz w:val="16"/>
+                <w:b w:val="0"/>
+              </w:rPr>
+              <w:t xml:space="preserve">Every model in your study is re-estimated once a year (pre-registered). This paper warns that the refit frequency can change rankings — a limitation to state, and a cheap PhD extension.</w:t>
+            </w:r>
+          </w:p>
+        </w:tc>
+      </w:tr>
+      <w:tr>
+        <w:tc>
+          <w:tcPr>
+            <w:tcW w:type="dxa" w:w="1701"/>
+            <w:shd w:val="clear" w:color="auto" w:fill="EAF1FB"/>
+          </w:tcPr>
+          <w:p>
+            <w:r>
+              <w:rPr>
+                <w:b/>
+                <w:sz w:val="16"/>
+              </w:rPr>
+              <w:t>Must read in the original</w:t>
+            </w:r>
+          </w:p>
+        </w:tc>
+        <w:tc>
+          <w:tcPr>
+            <w:tcW w:type="dxa" w:w="8164"/>
+            <w:shd w:val="clear" w:color="auto" w:fill="EAF1FB"/>
+          </w:tcPr>
+          <w:p>
+            <w:r>
+              <w:rPr>
+                <w:sz w:val="16"/>
+                <w:b w:val="0"/>
+              </w:rPr>
+              <w:t xml:space="preserve">Section 4.3 (estimation strategy) and Section 5 (results).</w:t>
+            </w:r>
+          </w:p>
+        </w:tc>
+      </w:tr>
+      <w:tr>
+        <w:tc>
+          <w:tcPr>
+            <w:tcW w:type="dxa" w:w="1701"/>
+          </w:tcPr>
+          <w:p>
+            <w:r>
+              <w:rPr>
+                <w:b/>
+                <w:sz w:val="16"/>
+              </w:rPr>
+              <w:t>Can skim / skip</w:t>
+            </w:r>
+          </w:p>
+        </w:tc>
+        <w:tc>
+          <w:tcPr>
+            <w:tcW w:type="dxa" w:w="8164"/>
+          </w:tcPr>
+          <w:p>
+            <w:r>
+              <w:rPr>
+                <w:sz w:val="16"/>
+                <w:b w:val="0"/>
+              </w:rPr>
+              <w:t xml:space="preserve">Descriptions of the ML algorithms.</w:t>
+            </w:r>
+          </w:p>
+        </w:tc>
+      </w:tr>
+      <w:tr>
+        <w:tc>
+          <w:tcPr>
+            <w:tcW w:type="dxa" w:w="1701"/>
+          </w:tcPr>
+          <w:p>
+            <w:r>
+              <w:rPr>
+                <w:b/>
+                <w:sz w:val="16"/>
+              </w:rPr>
+              <w:t>Key terms</w:t>
+            </w:r>
+          </w:p>
+        </w:tc>
+        <w:tc>
+          <w:tcPr>
+            <w:tcW w:type="dxa" w:w="8164"/>
+          </w:tcPr>
+          <w:p>
+            <w:r>
+              <w:rPr>
+                <w:sz w:val="16"/>
+                <w:b w:val="0"/>
+              </w:rPr>
+              <w:t xml:space="preserve">rolling window; re-estimation frequency; HAR-WLS; realised utility</w:t>
+            </w:r>
+          </w:p>
+        </w:tc>
+      </w:tr>
+      <w:tr>
+        <w:tc>
+          <w:tcPr>
+            <w:tcW w:type="dxa" w:w="1701"/>
+          </w:tcPr>
+          <w:p>
+            <w:r>
+              <w:rPr>
+                <w:b/>
+                <w:sz w:val="16"/>
+              </w:rPr>
+              <w:t>Strengths</w:t>
+            </w:r>
+          </w:p>
+        </w:tc>
+        <w:tc>
+          <w:tcPr>
+            <w:tcW w:type="dxa" w:w="8164"/>
+          </w:tcPr>
+          <w:p>
+            <w:r>
+              <w:rPr>
+                <w:sz w:val="16"/>
+                <w:b w:val="0"/>
+              </w:rPr>
+              <w:t xml:space="preserve">Very large sample; systematic design; several losses.</w:t>
+            </w:r>
+          </w:p>
+        </w:tc>
+      </w:tr>
+      <w:tr>
+        <w:tc>
+          <w:tcPr>
+            <w:tcW w:type="dxa" w:w="1701"/>
+          </w:tcPr>
+          <w:p>
+            <w:r>
+              <w:rPr>
+                <w:b/>
+                <w:sz w:val="16"/>
+              </w:rPr>
+              <w:t>Weaknesses / critique</w:t>
+            </w:r>
+          </w:p>
+        </w:tc>
+        <w:tc>
+          <w:tcPr>
+            <w:tcW w:type="dxa" w:w="8164"/>
+          </w:tcPr>
+          <w:p>
+            <w:r>
+              <w:rPr>
+                <w:sz w:val="16"/>
+                <w:b w:val="0"/>
+              </w:rPr>
+              <w:t xml:space="preserve">Preprint (check for a published version); short test period (2022–23); one-day horizon only.</w:t>
+            </w:r>
+          </w:p>
+        </w:tc>
+      </w:tr>
+      <w:tr>
+        <w:tc>
+          <w:tcPr>
+            <w:tcW w:type="dxa" w:w="1701"/>
+            <w:shd w:val="clear" w:color="auto" w:fill="EAF1FB"/>
+          </w:tcPr>
+          <w:p>
+            <w:r>
+              <w:rPr>
+                <w:b/>
+                <w:sz w:val="16"/>
+              </w:rPr>
+              <w:t>Use it as · where</w:t>
+            </w:r>
+          </w:p>
+        </w:tc>
+        <w:tc>
+          <w:tcPr>
+            <w:tcW w:type="dxa" w:w="8164"/>
+            <w:shd w:val="clear" w:color="auto" w:fill="EAF1FB"/>
+          </w:tcPr>
+          <w:p>
+            <w:r>
+              <w:rPr>
+                <w:sz w:val="16"/>
+                <w:b w:val="0"/>
+              </w:rPr>
+              <w:t xml:space="preserve">Evidence · 2.5; Limitations</w:t>
+            </w:r>
+          </w:p>
+        </w:tc>
+      </w:tr>
+    </w:tbl>
+    <w:p>
+      <w:pPr>
+        <w:spacing w:after="80"/>
+      </w:pPr>
+    </w:p>
+    <w:tbl>
+      <w:tblPr>
+        <w:tblStyle w:val="TableGrid"/>
+        <w:tblW w:type="auto" w:w="0"/>
+        <w:jc w:val="center"/>
+        <w:tblLook w:firstColumn="1" w:firstRow="1" w:lastColumn="0" w:lastRow="0" w:noHBand="0" w:noVBand="1" w:val="04A0"/>
+      </w:tblPr>
+      <w:tblGrid>
+        <w:gridCol w:w="5100"/>
+        <w:gridCol w:w="5100"/>
+      </w:tblGrid>
+      <w:tr>
+        <w:tc>
+          <w:tcPr>
+            <w:tcW w:type="dxa" w:w="8164"/>
+            <w:gridSpan w:val="2"/>
+            <w:shd w:val="clear" w:color="auto" w:fill="1F4E79"/>
+          </w:tcPr>
+          <w:p>
+            <w:r>
+              <w:rPr>
+                <w:color w:val="FFFFFF"/>
+                <w:sz w:val="19"/>
+                <w:b/>
+              </w:rPr>
+              <w:t xml:space="preserve">Teller, A., Pigorsch, U. &amp; Pigorsch, C. (2022) Short- to long-term realized volatility forecasting using extreme gradient boosting. SSRN working paper 4267541.</w:t>
+            </w:r>
+          </w:p>
+        </w:tc>
+      </w:tr>
+      <w:tr>
+        <w:tc>
+          <w:tcPr>
+            <w:tcW w:type="dxa" w:w="1701"/>
+            <w:shd w:val="clear" w:color="auto" w:fill="FFF2CC"/>
+          </w:tcPr>
+          <w:p>
+            <w:r>
+              <w:rPr>
+                <w:b/>
+                <w:sz w:val="16"/>
+              </w:rPr>
+              <w:t>Source basis</w:t>
+            </w:r>
+          </w:p>
+        </w:tc>
+        <w:tc>
+          <w:tcPr>
+            <w:tcW w:type="dxa" w:w="8164"/>
+            <w:shd w:val="clear" w:color="auto" w:fill="FFF2CC"/>
+          </w:tcPr>
+          <w:p>
+            <w:r>
+              <w:rPr>
+                <w:sz w:val="16"/>
+              </w:rPr>
+              <w:t>ABSTRACT / summary read in this session; read the full paper before relying on details</w:t>
+            </w:r>
+          </w:p>
+        </w:tc>
+      </w:tr>
+      <w:tr>
+        <w:tc>
+          <w:tcPr>
+            <w:tcW w:type="dxa" w:w="1701"/>
+          </w:tcPr>
+          <w:p>
+            <w:r>
+              <w:rPr>
+                <w:b/>
+                <w:sz w:val="16"/>
+              </w:rPr>
+              <w:t>Summary</w:t>
+            </w:r>
+          </w:p>
+        </w:tc>
+        <w:tc>
+          <w:tcPr>
+            <w:tcW w:type="dxa" w:w="8164"/>
+          </w:tcPr>
+          <w:p>
+            <w:r>
+              <w:rPr>
+                <w:sz w:val="16"/>
+                <w:b w:val="0"/>
+              </w:rPr>
+              <w:t xml:space="preserve">Uses XGBoost to forecast realised volatility at short and longer horizons, against HAR and LSTM models.</w:t>
+            </w:r>
+          </w:p>
+        </w:tc>
+      </w:tr>
+      <w:tr>
+        <w:tc>
+          <w:tcPr>
+            <w:tcW w:type="dxa" w:w="1701"/>
+          </w:tcPr>
+          <w:p>
+            <w:r>
+              <w:rPr>
+                <w:b/>
+                <w:sz w:val="16"/>
+              </w:rPr>
+              <w:t>Dataset</w:t>
+            </w:r>
+          </w:p>
+        </w:tc>
+        <w:tc>
+          <w:tcPr>
+            <w:tcW w:type="dxa" w:w="8164"/>
+          </w:tcPr>
+          <w:p>
+            <w:r>
+              <w:rPr>
+                <w:sz w:val="16"/>
+                <w:b w:val="0"/>
+              </w:rPr>
+              <w:t xml:space="preserve">Realised volatility (confirm the assets and period in the paper).</w:t>
+            </w:r>
+          </w:p>
+        </w:tc>
+      </w:tr>
+      <w:tr>
+        <w:tc>
+          <w:tcPr>
+            <w:tcW w:type="dxa" w:w="1701"/>
+          </w:tcPr>
+          <w:p>
+            <w:r>
+              <w:rPr>
+                <w:b/>
+                <w:sz w:val="16"/>
+              </w:rPr>
+              <w:t>Methodology</w:t>
+            </w:r>
+          </w:p>
+        </w:tc>
+        <w:tc>
+          <w:tcPr>
+            <w:tcW w:type="dxa" w:w="8164"/>
+          </w:tcPr>
+          <w:p>
+            <w:r>
+              <w:rPr>
+                <w:sz w:val="16"/>
+                <w:b w:val="0"/>
+              </w:rPr>
+              <w:t xml:space="preserve">XGBoost with linear and with tree base learners vs HAR and LSTM; several forecast horizons.</w:t>
+            </w:r>
+          </w:p>
+        </w:tc>
+      </w:tr>
+      <w:tr>
+        <w:tc>
+          <w:tcPr>
+            <w:tcW w:type="dxa" w:w="1701"/>
+          </w:tcPr>
+          <w:p>
+            <w:r>
+              <w:rPr>
+                <w:b/>
+                <w:sz w:val="16"/>
+              </w:rPr>
+              <w:t>Results</w:t>
+            </w:r>
+          </w:p>
+        </w:tc>
+        <w:tc>
+          <w:tcPr>
+            <w:tcW w:type="dxa" w:w="8164"/>
+          </w:tcPr>
+          <w:p>
+            <w:r>
+              <w:rPr>
+                <w:sz w:val="16"/>
+                <w:b w:val="0"/>
+              </w:rPr>
+              <w:t xml:space="preserve">• XGBoost beats HAR and LSTM one step ahead.</w:t>
+            </w:r>
+          </w:p>
+          <w:p>
+            <w:r>
+              <w:rPr>
+                <w:sz w:val="16"/>
+                <w:b w:val="0"/>
+              </w:rPr>
+              <w:t xml:space="preserve">• At longer horizons XGBoost with linear base learners does better than the tree version: non-linearity matters mainly for short horizons.</w:t>
+            </w:r>
+          </w:p>
+        </w:tc>
+      </w:tr>
+      <w:tr>
+        <w:tc>
+          <w:tcPr>
+            <w:tcW w:type="dxa" w:w="1701"/>
+            <w:shd w:val="clear" w:color="auto" w:fill="EAF1FB"/>
+          </w:tcPr>
+          <w:p>
+            <w:r>
+              <w:rPr>
+                <w:b/>
+                <w:sz w:val="16"/>
+              </w:rPr>
+              <w:t>How it relates to MY study</w:t>
+            </w:r>
+          </w:p>
+        </w:tc>
+        <w:tc>
+          <w:tcPr>
+            <w:tcW w:type="dxa" w:w="8164"/>
+            <w:shd w:val="clear" w:color="auto" w:fill="EAF1FB"/>
+          </w:tcPr>
+          <w:p>
+            <w:r>
+              <w:rPr>
+                <w:sz w:val="16"/>
+                <w:b w:val="0"/>
+              </w:rPr>
+              <w:t xml:space="preserve">Your horizon is 5 days. Their result fits your finding that the linear and structural models do best and that tree models add little.</w:t>
+            </w:r>
+          </w:p>
+        </w:tc>
+      </w:tr>
+      <w:tr>
+        <w:tc>
+          <w:tcPr>
+            <w:tcW w:type="dxa" w:w="1701"/>
+            <w:shd w:val="clear" w:color="auto" w:fill="EAF1FB"/>
+          </w:tcPr>
+          <w:p>
+            <w:r>
+              <w:rPr>
+                <w:b/>
+                <w:sz w:val="16"/>
+              </w:rPr>
+              <w:t>Must read in the original</w:t>
+            </w:r>
+          </w:p>
+        </w:tc>
+        <w:tc>
+          <w:tcPr>
+            <w:tcW w:type="dxa" w:w="8164"/>
+            <w:shd w:val="clear" w:color="auto" w:fill="EAF1FB"/>
+          </w:tcPr>
+          <w:p>
+            <w:r>
+              <w:rPr>
+                <w:sz w:val="16"/>
+                <w:b w:val="0"/>
+              </w:rPr>
+              <w:t xml:space="preserve">Abstract and the results by horizon.</w:t>
+            </w:r>
+          </w:p>
+        </w:tc>
+      </w:tr>
+      <w:tr>
+        <w:tc>
+          <w:tcPr>
+            <w:tcW w:type="dxa" w:w="1701"/>
+          </w:tcPr>
+          <w:p>
+            <w:r>
+              <w:rPr>
+                <w:b/>
+                <w:sz w:val="16"/>
+              </w:rPr>
+              <w:t>Can skim / skip</w:t>
+            </w:r>
+          </w:p>
+        </w:tc>
+        <w:tc>
+          <w:tcPr>
+            <w:tcW w:type="dxa" w:w="8164"/>
+          </w:tcPr>
+          <w:p>
+            <w:r>
+              <w:rPr>
+                <w:sz w:val="16"/>
+                <w:b w:val="0"/>
+              </w:rPr>
+              <w:t xml:space="preserve">—</w:t>
+            </w:r>
+          </w:p>
+        </w:tc>
+      </w:tr>
+      <w:tr>
+        <w:tc>
+          <w:tcPr>
+            <w:tcW w:type="dxa" w:w="1701"/>
+          </w:tcPr>
+          <w:p>
+            <w:r>
+              <w:rPr>
+                <w:b/>
+                <w:sz w:val="16"/>
+              </w:rPr>
+              <w:t>Key terms</w:t>
+            </w:r>
+          </w:p>
+        </w:tc>
+        <w:tc>
+          <w:tcPr>
+            <w:tcW w:type="dxa" w:w="8164"/>
+          </w:tcPr>
+          <w:p>
+            <w:r>
+              <w:rPr>
+                <w:sz w:val="16"/>
+                <w:b w:val="0"/>
+              </w:rPr>
+              <w:t xml:space="preserve">XGBoost; linear base learner; forecast horizon</w:t>
+            </w:r>
+          </w:p>
+        </w:tc>
+      </w:tr>
+      <w:tr>
+        <w:tc>
+          <w:tcPr>
+            <w:tcW w:type="dxa" w:w="1701"/>
+          </w:tcPr>
+          <w:p>
+            <w:r>
+              <w:rPr>
+                <w:b/>
+                <w:sz w:val="16"/>
+              </w:rPr>
+              <w:t>Strengths</w:t>
+            </w:r>
+          </w:p>
+        </w:tc>
+        <w:tc>
+          <w:tcPr>
+            <w:tcW w:type="dxa" w:w="8164"/>
+          </w:tcPr>
+          <w:p>
+            <w:r>
+              <w:rPr>
+                <w:sz w:val="16"/>
+                <w:b w:val="0"/>
+              </w:rPr>
+              <w:t xml:space="preserve">Direct comparison of XGBoost, HAR and LSTM.</w:t>
+            </w:r>
+          </w:p>
+        </w:tc>
+      </w:tr>
+      <w:tr>
+        <w:tc>
+          <w:tcPr>
+            <w:tcW w:type="dxa" w:w="1701"/>
+          </w:tcPr>
+          <w:p>
+            <w:r>
+              <w:rPr>
+                <w:b/>
+                <w:sz w:val="16"/>
+              </w:rPr>
+              <w:t>Weaknesses / critique</w:t>
+            </w:r>
+          </w:p>
+        </w:tc>
+        <w:tc>
+          <w:tcPr>
+            <w:tcW w:type="dxa" w:w="8164"/>
+          </w:tcPr>
+          <w:p>
+            <w:r>
+              <w:rPr>
+                <w:sz w:val="16"/>
+                <w:b w:val="0"/>
+              </w:rPr>
+              <w:t xml:space="preserve">Working paper, not peer-reviewed; only the abstract was read.</w:t>
+            </w:r>
+          </w:p>
+        </w:tc>
+      </w:tr>
+      <w:tr>
+        <w:tc>
+          <w:tcPr>
+            <w:tcW w:type="dxa" w:w="1701"/>
+            <w:shd w:val="clear" w:color="auto" w:fill="EAF1FB"/>
+          </w:tcPr>
+          <w:p>
+            <w:r>
+              <w:rPr>
+                <w:b/>
+                <w:sz w:val="16"/>
+              </w:rPr>
+              <w:t>Use it as · where</w:t>
+            </w:r>
+          </w:p>
+        </w:tc>
+        <w:tc>
+          <w:tcPr>
+            <w:tcW w:type="dxa" w:w="8164"/>
+            <w:shd w:val="clear" w:color="auto" w:fill="EAF1FB"/>
+          </w:tcPr>
+          <w:p>
+            <w:r>
+              <w:rPr>
+                <w:sz w:val="16"/>
+                <w:b w:val="0"/>
+              </w:rPr>
+              <w:t xml:space="preserve">Evidence · 2.5 (cite as a working paper)</w:t>
+            </w:r>
+          </w:p>
+        </w:tc>
+      </w:tr>
+    </w:tbl>
+    <w:p>
+      <w:pPr>
+        <w:spacing w:after="80"/>
+      </w:pPr>
+    </w:p>
+    <w:tbl>
+      <w:tblPr>
+        <w:tblStyle w:val="TableGrid"/>
+        <w:tblW w:type="auto" w:w="0"/>
+        <w:jc w:val="center"/>
+        <w:tblLook w:firstColumn="1" w:firstRow="1" w:lastColumn="0" w:lastRow="0" w:noHBand="0" w:noVBand="1" w:val="04A0"/>
+      </w:tblPr>
+      <w:tblGrid>
+        <w:gridCol w:w="5100"/>
+        <w:gridCol w:w="5100"/>
+      </w:tblGrid>
+      <w:tr>
+        <w:tc>
+          <w:tcPr>
+            <w:tcW w:type="dxa" w:w="8164"/>
+            <w:gridSpan w:val="2"/>
+            <w:shd w:val="clear" w:color="auto" w:fill="1F4E79"/>
+          </w:tcPr>
+          <w:p>
+            <w:r>
+              <w:rPr>
+                <w:color w:val="FFFFFF"/>
+                <w:sz w:val="19"/>
+                <w:b/>
+              </w:rPr>
+              <w:t xml:space="preserve">Bates, J.M. &amp; Granger, C.W.J. (1969) The combination of forecasts. Operational Research Quarterly, 20(4), 451–468.</w:t>
+            </w:r>
+          </w:p>
+        </w:tc>
+      </w:tr>
+      <w:tr>
+        <w:tc>
+          <w:tcPr>
+            <w:tcW w:type="dxa" w:w="1701"/>
+            <w:shd w:val="clear" w:color="auto" w:fill="EFEFEF"/>
+          </w:tcPr>
+          <w:p>
+            <w:r>
+              <w:rPr>
+                <w:b/>
+                <w:sz w:val="16"/>
+              </w:rPr>
+              <w:t>Source basis</w:t>
+            </w:r>
+          </w:p>
+        </w:tc>
+        <w:tc>
+          <w:tcPr>
+            <w:tcW w:type="dxa" w:w="8164"/>
+            <w:shd w:val="clear" w:color="auto" w:fill="EFEFEF"/>
+          </w:tcPr>
+          <w:p>
+            <w:r>
+              <w:rPr>
+                <w:sz w:val="16"/>
+              </w:rPr>
+              <w:t>STANDARD KNOWLEDGE, not re-read this session; confirm every detail and page before citing</w:t>
+            </w:r>
+          </w:p>
+        </w:tc>
+      </w:tr>
+      <w:tr>
+        <w:tc>
+          <w:tcPr>
+            <w:tcW w:type="dxa" w:w="1701"/>
+          </w:tcPr>
+          <w:p>
+            <w:r>
+              <w:rPr>
+                <w:b/>
+                <w:sz w:val="16"/>
+              </w:rPr>
+              <w:t>Summary</w:t>
+            </w:r>
+          </w:p>
+        </w:tc>
+        <w:tc>
+          <w:tcPr>
+            <w:tcW w:type="dxa" w:w="8164"/>
+          </w:tcPr>
+          <w:p>
+            <w:r>
+              <w:rPr>
+                <w:sz w:val="16"/>
+                <w:b w:val="0"/>
+              </w:rPr>
+              <w:t xml:space="preserve">Shows that combining two forecasts can be more accurate than either, with weights based on their past errors.</w:t>
+            </w:r>
+          </w:p>
+        </w:tc>
+      </w:tr>
+      <w:tr>
+        <w:tc>
+          <w:tcPr>
+            <w:tcW w:type="dxa" w:w="1701"/>
+          </w:tcPr>
+          <w:p>
+            <w:r>
+              <w:rPr>
+                <w:b/>
+                <w:sz w:val="16"/>
+              </w:rPr>
+              <w:t>Dataset</w:t>
+            </w:r>
+          </w:p>
+        </w:tc>
+        <w:tc>
+          <w:tcPr>
+            <w:tcW w:type="dxa" w:w="8164"/>
+          </w:tcPr>
+          <w:p>
+            <w:r>
+              <w:rPr>
+                <w:sz w:val="16"/>
+                <w:b w:val="0"/>
+              </w:rPr>
+              <w:t xml:space="preserve">Airline passenger forecasts (confirm).</w:t>
+            </w:r>
+          </w:p>
+        </w:tc>
+      </w:tr>
+      <w:tr>
+        <w:tc>
+          <w:tcPr>
+            <w:tcW w:type="dxa" w:w="1701"/>
+          </w:tcPr>
+          <w:p>
+            <w:r>
+              <w:rPr>
+                <w:b/>
+                <w:sz w:val="16"/>
+              </w:rPr>
+              <w:t>Methodology</w:t>
+            </w:r>
+          </w:p>
+        </w:tc>
+        <w:tc>
+          <w:tcPr>
+            <w:tcW w:type="dxa" w:w="8164"/>
+          </w:tcPr>
+          <w:p>
+            <w:r>
+              <w:rPr>
+                <w:sz w:val="16"/>
+                <w:b w:val="0"/>
+              </w:rPr>
+              <w:t xml:space="preserve">Weighted combinations of two forecasts; weights from past error variances.</w:t>
+            </w:r>
+          </w:p>
+        </w:tc>
+      </w:tr>
+      <w:tr>
+        <w:tc>
+          <w:tcPr>
+            <w:tcW w:type="dxa" w:w="1701"/>
+          </w:tcPr>
+          <w:p>
+            <w:r>
+              <w:rPr>
+                <w:b/>
+                <w:sz w:val="16"/>
+              </w:rPr>
+              <w:t>Results</w:t>
+            </w:r>
+          </w:p>
+        </w:tc>
+        <w:tc>
+          <w:tcPr>
+            <w:tcW w:type="dxa" w:w="8164"/>
+          </w:tcPr>
+          <w:p>
+            <w:r>
+              <w:rPr>
+                <w:sz w:val="16"/>
+                <w:b w:val="0"/>
+              </w:rPr>
+              <w:t xml:space="preserve">• The combination often has a smaller error than either forecast.</w:t>
+            </w:r>
+          </w:p>
+          <w:p>
+            <w:r>
+              <w:rPr>
+                <w:sz w:val="16"/>
+                <w:b w:val="0"/>
+              </w:rPr>
+              <w:t xml:space="preserve">• Simple weights work well.</w:t>
+            </w:r>
+          </w:p>
+        </w:tc>
+      </w:tr>
+      <w:tr>
+        <w:tc>
+          <w:tcPr>
+            <w:tcW w:type="dxa" w:w="1701"/>
+            <w:shd w:val="clear" w:color="auto" w:fill="EAF1FB"/>
+          </w:tcPr>
+          <w:p>
+            <w:r>
+              <w:rPr>
+                <w:b/>
+                <w:sz w:val="16"/>
+              </w:rPr>
+              <w:t>How it relates to MY study</w:t>
+            </w:r>
+          </w:p>
+        </w:tc>
+        <w:tc>
+          <w:tcPr>
+            <w:tcW w:type="dxa" w:w="8164"/>
+            <w:shd w:val="clear" w:color="auto" w:fill="EAF1FB"/>
+          </w:tcPr>
+          <w:p>
+            <w:r>
+              <w:rPr>
+                <w:sz w:val="16"/>
+                <w:b w:val="0"/>
+              </w:rPr>
+              <w:t xml:space="preserve">Your E4 average of GARCH and LSTM matched GARCH overall (QLIKE 0.380), was better in COVID-19, 2022 and calm days, and worse in the GFC.</w:t>
+            </w:r>
+          </w:p>
+        </w:tc>
+      </w:tr>
+      <w:tr>
+        <w:tc>
+          <w:tcPr>
+            <w:tcW w:type="dxa" w:w="1701"/>
+            <w:shd w:val="clear" w:color="auto" w:fill="EAF1FB"/>
+          </w:tcPr>
+          <w:p>
+            <w:r>
+              <w:rPr>
+                <w:b/>
+                <w:sz w:val="16"/>
+              </w:rPr>
+              <w:t>Must read in the original</w:t>
+            </w:r>
+          </w:p>
+        </w:tc>
+        <w:tc>
+          <w:tcPr>
+            <w:tcW w:type="dxa" w:w="8164"/>
+            <w:shd w:val="clear" w:color="auto" w:fill="EAF1FB"/>
+          </w:tcPr>
+          <w:p>
+            <w:r>
+              <w:rPr>
+                <w:sz w:val="16"/>
+                <w:b w:val="0"/>
+              </w:rPr>
+              <w:t xml:space="preserve">The main argument and the worked examples.</w:t>
+            </w:r>
+          </w:p>
+        </w:tc>
+      </w:tr>
+      <w:tr>
+        <w:tc>
+          <w:tcPr>
+            <w:tcW w:type="dxa" w:w="1701"/>
+          </w:tcPr>
+          <w:p>
+            <w:r>
+              <w:rPr>
+                <w:b/>
+                <w:sz w:val="16"/>
+              </w:rPr>
+              <w:t>Can skim / skip</w:t>
+            </w:r>
+          </w:p>
+        </w:tc>
+        <w:tc>
+          <w:tcPr>
+            <w:tcW w:type="dxa" w:w="8164"/>
+          </w:tcPr>
+          <w:p>
+            <w:r>
+              <w:rPr>
+                <w:sz w:val="16"/>
+                <w:b w:val="0"/>
+              </w:rPr>
+              <w:t xml:space="preserve">—</w:t>
+            </w:r>
+          </w:p>
+        </w:tc>
+      </w:tr>
+      <w:tr>
+        <w:tc>
+          <w:tcPr>
+            <w:tcW w:type="dxa" w:w="1701"/>
+          </w:tcPr>
+          <w:p>
+            <w:r>
+              <w:rPr>
+                <w:b/>
+                <w:sz w:val="16"/>
+              </w:rPr>
+              <w:t>Key terms</w:t>
+            </w:r>
+          </w:p>
+        </w:tc>
+        <w:tc>
+          <w:tcPr>
+            <w:tcW w:type="dxa" w:w="8164"/>
+          </w:tcPr>
+          <w:p>
+            <w:r>
+              <w:rPr>
+                <w:sz w:val="16"/>
+                <w:b w:val="0"/>
+              </w:rPr>
+              <w:t xml:space="preserve">forecast combination; combination weights; forecast-combination puzzle</w:t>
+            </w:r>
+          </w:p>
+        </w:tc>
+      </w:tr>
+      <w:tr>
+        <w:tc>
+          <w:tcPr>
+            <w:tcW w:type="dxa" w:w="1701"/>
+          </w:tcPr>
+          <w:p>
+            <w:r>
+              <w:rPr>
+                <w:b/>
+                <w:sz w:val="16"/>
+              </w:rPr>
+              <w:t>Strengths</w:t>
+            </w:r>
+          </w:p>
+        </w:tc>
+        <w:tc>
+          <w:tcPr>
+            <w:tcW w:type="dxa" w:w="8164"/>
+          </w:tcPr>
+          <w:p>
+            <w:r>
+              <w:rPr>
+                <w:sz w:val="16"/>
+                <w:b w:val="0"/>
+              </w:rPr>
+              <w:t xml:space="preserve">Foundational; simple.</w:t>
+            </w:r>
+          </w:p>
+        </w:tc>
+      </w:tr>
+      <w:tr>
+        <w:tc>
+          <w:tcPr>
+            <w:tcW w:type="dxa" w:w="1701"/>
+          </w:tcPr>
+          <w:p>
+            <w:r>
+              <w:rPr>
+                <w:b/>
+                <w:sz w:val="16"/>
+              </w:rPr>
+              <w:t>Weaknesses / critique</w:t>
+            </w:r>
+          </w:p>
+        </w:tc>
+        <w:tc>
+          <w:tcPr>
+            <w:tcW w:type="dxa" w:w="8164"/>
+          </w:tcPr>
+          <w:p>
+            <w:r>
+              <w:rPr>
+                <w:sz w:val="16"/>
+                <w:b w:val="0"/>
+              </w:rPr>
+              <w:t xml:space="preserve">Old; assumes the forecasts' error properties are stable.</w:t>
+            </w:r>
+          </w:p>
+        </w:tc>
+      </w:tr>
+      <w:tr>
+        <w:tc>
+          <w:tcPr>
+            <w:tcW w:type="dxa" w:w="1701"/>
+            <w:shd w:val="clear" w:color="auto" w:fill="EAF1FB"/>
+          </w:tcPr>
+          <w:p>
+            <w:r>
+              <w:rPr>
+                <w:b/>
+                <w:sz w:val="16"/>
+              </w:rPr>
+              <w:t>Use it as · where</w:t>
+            </w:r>
+          </w:p>
+        </w:tc>
+        <w:tc>
+          <w:tcPr>
+            <w:tcW w:type="dxa" w:w="8164"/>
+            <w:shd w:val="clear" w:color="auto" w:fill="EAF1FB"/>
+          </w:tcPr>
+          <w:p>
+            <w:r>
+              <w:rPr>
+                <w:sz w:val="16"/>
+                <w:b w:val="0"/>
+              </w:rPr>
+              <w:t xml:space="preserve">Method · Chapter 3 (E4); Discussion</w:t>
+            </w:r>
+          </w:p>
+        </w:tc>
+      </w:tr>
+    </w:tbl>
+    <w:p>
+      <w:pPr>
+        <w:spacing w:after="80"/>
+      </w:pPr>
+    </w:p>
+    <w:tbl>
+      <w:tblPr>
+        <w:tblStyle w:val="TableGrid"/>
+        <w:tblW w:type="auto" w:w="0"/>
+        <w:jc w:val="center"/>
+        <w:tblLook w:firstColumn="1" w:firstRow="1" w:lastColumn="0" w:lastRow="0" w:noHBand="0" w:noVBand="1" w:val="04A0"/>
+      </w:tblPr>
+      <w:tblGrid>
+        <w:gridCol w:w="5100"/>
+        <w:gridCol w:w="5100"/>
+      </w:tblGrid>
+      <w:tr>
+        <w:tc>
+          <w:tcPr>
+            <w:tcW w:type="dxa" w:w="8164"/>
+            <w:gridSpan w:val="2"/>
+            <w:shd w:val="clear" w:color="auto" w:fill="1F4E79"/>
+          </w:tcPr>
+          <w:p>
+            <w:r>
+              <w:rPr>
+                <w:color w:val="FFFFFF"/>
+                <w:sz w:val="19"/>
+                <w:b/>
+              </w:rPr>
+              <w:t xml:space="preserve">Holm, S. (1979) A simple sequentially rejective multiple test procedure. Scandinavian Journal of Statistics, 6(2), 65–70.</w:t>
+            </w:r>
+          </w:p>
+        </w:tc>
+      </w:tr>
+      <w:tr>
+        <w:tc>
+          <w:tcPr>
+            <w:tcW w:type="dxa" w:w="1701"/>
+            <w:shd w:val="clear" w:color="auto" w:fill="EFEFEF"/>
+          </w:tcPr>
+          <w:p>
+            <w:r>
+              <w:rPr>
+                <w:b/>
+                <w:sz w:val="16"/>
+              </w:rPr>
+              <w:t>Source basis</w:t>
+            </w:r>
+          </w:p>
+        </w:tc>
+        <w:tc>
+          <w:tcPr>
+            <w:tcW w:type="dxa" w:w="8164"/>
+            <w:shd w:val="clear" w:color="auto" w:fill="EFEFEF"/>
+          </w:tcPr>
+          <w:p>
+            <w:r>
+              <w:rPr>
+                <w:sz w:val="16"/>
+              </w:rPr>
+              <w:t>STANDARD KNOWLEDGE, not re-read this session; confirm every detail and page before citing</w:t>
+            </w:r>
+          </w:p>
+        </w:tc>
+      </w:tr>
+      <w:tr>
+        <w:tc>
+          <w:tcPr>
+            <w:tcW w:type="dxa" w:w="1701"/>
+          </w:tcPr>
+          <w:p>
+            <w:r>
+              <w:rPr>
+                <w:b/>
+                <w:sz w:val="16"/>
+              </w:rPr>
+              <w:t>Summary</w:t>
+            </w:r>
+          </w:p>
+        </w:tc>
+        <w:tc>
+          <w:tcPr>
+            <w:tcW w:type="dxa" w:w="8164"/>
+          </w:tcPr>
+          <w:p>
+            <w:r>
+              <w:rPr>
+                <w:sz w:val="16"/>
+                <w:b w:val="0"/>
+              </w:rPr>
+              <w:t xml:space="preserve">A step-down method that limits the chance of any false positive when several tests are run together.</w:t>
+            </w:r>
+          </w:p>
+        </w:tc>
+      </w:tr>
+      <w:tr>
+        <w:tc>
+          <w:tcPr>
+            <w:tcW w:type="dxa" w:w="1701"/>
+          </w:tcPr>
+          <w:p>
+            <w:r>
+              <w:rPr>
+                <w:b/>
+                <w:sz w:val="16"/>
+              </w:rPr>
+              <w:t>Dataset</w:t>
+            </w:r>
+          </w:p>
+        </w:tc>
+        <w:tc>
+          <w:tcPr>
+            <w:tcW w:type="dxa" w:w="8164"/>
+          </w:tcPr>
+          <w:p>
+            <w:r>
+              <w:rPr>
+                <w:sz w:val="16"/>
+                <w:b w:val="0"/>
+              </w:rPr>
+              <w:t xml:space="preserve">— (statistical method).</w:t>
+            </w:r>
+          </w:p>
+        </w:tc>
+      </w:tr>
+      <w:tr>
+        <w:tc>
+          <w:tcPr>
+            <w:tcW w:type="dxa" w:w="1701"/>
+          </w:tcPr>
+          <w:p>
+            <w:r>
+              <w:rPr>
+                <w:b/>
+                <w:sz w:val="16"/>
+              </w:rPr>
+              <w:t>Methodology</w:t>
+            </w:r>
+          </w:p>
+        </w:tc>
+        <w:tc>
+          <w:tcPr>
+            <w:tcW w:type="dxa" w:w="8164"/>
+          </w:tcPr>
+          <w:p>
+            <w:r>
+              <w:rPr>
+                <w:sz w:val="16"/>
+                <w:b w:val="0"/>
+              </w:rPr>
+              <w:t xml:space="preserve">Sort the p-values; compare the smallest with α/m, the next with α/(m−1), and so on; stop at the first test that is not rejected.</w:t>
+            </w:r>
+          </w:p>
+        </w:tc>
+      </w:tr>
+      <w:tr>
+        <w:tc>
+          <w:tcPr>
+            <w:tcW w:type="dxa" w:w="1701"/>
+          </w:tcPr>
+          <w:p>
+            <w:r>
+              <w:rPr>
+                <w:b/>
+                <w:sz w:val="16"/>
+              </w:rPr>
+              <w:t>Results</w:t>
+            </w:r>
+          </w:p>
+        </w:tc>
+        <w:tc>
+          <w:tcPr>
+            <w:tcW w:type="dxa" w:w="8164"/>
+          </w:tcPr>
+          <w:p>
+            <w:r>
+              <w:rPr>
+                <w:sz w:val="16"/>
+                <w:b w:val="0"/>
+              </w:rPr>
+              <w:t xml:space="preserve">• Controls the family-wise error rate.</w:t>
+            </w:r>
+          </w:p>
+          <w:p>
+            <w:r>
+              <w:rPr>
+                <w:sz w:val="16"/>
+                <w:b w:val="0"/>
+              </w:rPr>
+              <w:t xml:space="preserve">• Always at least as powerful as the Bonferroni correction.</w:t>
+            </w:r>
+          </w:p>
+        </w:tc>
+      </w:tr>
+      <w:tr>
+        <w:tc>
+          <w:tcPr>
+            <w:tcW w:type="dxa" w:w="1701"/>
+            <w:shd w:val="clear" w:color="auto" w:fill="EAF1FB"/>
+          </w:tcPr>
+          <w:p>
+            <w:r>
+              <w:rPr>
+                <w:b/>
+                <w:sz w:val="16"/>
+              </w:rPr>
+              <w:t>How it relates to MY study</w:t>
+            </w:r>
+          </w:p>
+        </w:tc>
+        <w:tc>
+          <w:tcPr>
+            <w:tcW w:type="dxa" w:w="8164"/>
+            <w:shd w:val="clear" w:color="auto" w:fill="EAF1FB"/>
+          </w:tcPr>
+          <w:p>
+            <w:r>
+              <w:rPr>
+                <w:sz w:val="16"/>
+                <w:b w:val="0"/>
+              </w:rPr>
+              <w:t xml:space="preserve">Used for the primary family of your A3 (three GARCH hybrids vs GARCH): Holm p = 1.0, 1.0 and 0.36.</w:t>
+            </w:r>
+          </w:p>
+        </w:tc>
+      </w:tr>
+      <w:tr>
+        <w:tc>
+          <w:tcPr>
+            <w:tcW w:type="dxa" w:w="1701"/>
+            <w:shd w:val="clear" w:color="auto" w:fill="EAF1FB"/>
+          </w:tcPr>
+          <w:p>
+            <w:r>
+              <w:rPr>
+                <w:b/>
+                <w:sz w:val="16"/>
+              </w:rPr>
+              <w:t>Must read in the original</w:t>
+            </w:r>
+          </w:p>
+        </w:tc>
+        <w:tc>
+          <w:tcPr>
+            <w:tcW w:type="dxa" w:w="8164"/>
+            <w:shd w:val="clear" w:color="auto" w:fill="EAF1FB"/>
+          </w:tcPr>
+          <w:p>
+            <w:r>
+              <w:rPr>
+                <w:sz w:val="16"/>
+                <w:b w:val="0"/>
+              </w:rPr>
+              <w:t xml:space="preserve">The procedure (a short paper).</w:t>
+            </w:r>
+          </w:p>
+        </w:tc>
+      </w:tr>
+      <w:tr>
+        <w:tc>
+          <w:tcPr>
+            <w:tcW w:type="dxa" w:w="1701"/>
+          </w:tcPr>
+          <w:p>
+            <w:r>
+              <w:rPr>
+                <w:b/>
+                <w:sz w:val="16"/>
+              </w:rPr>
+              <w:t>Can skim / skip</w:t>
+            </w:r>
+          </w:p>
+        </w:tc>
+        <w:tc>
+          <w:tcPr>
+            <w:tcW w:type="dxa" w:w="8164"/>
+          </w:tcPr>
+          <w:p>
+            <w:r>
+              <w:rPr>
+                <w:sz w:val="16"/>
+                <w:b w:val="0"/>
+              </w:rPr>
+              <w:t xml:space="preserve">—</w:t>
+            </w:r>
+          </w:p>
+        </w:tc>
+      </w:tr>
+      <w:tr>
+        <w:tc>
+          <w:tcPr>
+            <w:tcW w:type="dxa" w:w="1701"/>
+          </w:tcPr>
+          <w:p>
+            <w:r>
+              <w:rPr>
+                <w:b/>
+                <w:sz w:val="16"/>
+              </w:rPr>
+              <w:t>Key terms</w:t>
+            </w:r>
+          </w:p>
+        </w:tc>
+        <w:tc>
+          <w:tcPr>
+            <w:tcW w:type="dxa" w:w="8164"/>
+          </w:tcPr>
+          <w:p>
+            <w:r>
+              <w:rPr>
+                <w:sz w:val="16"/>
+                <w:b w:val="0"/>
+              </w:rPr>
+              <w:t xml:space="preserve">family-wise error rate; Bonferroni; multiple testing</w:t>
+            </w:r>
+          </w:p>
+        </w:tc>
+      </w:tr>
+      <w:tr>
+        <w:tc>
+          <w:tcPr>
+            <w:tcW w:type="dxa" w:w="1701"/>
+          </w:tcPr>
+          <w:p>
+            <w:r>
+              <w:rPr>
+                <w:b/>
+                <w:sz w:val="16"/>
+              </w:rPr>
+              <w:t>Strengths</w:t>
+            </w:r>
+          </w:p>
+        </w:tc>
+        <w:tc>
+          <w:tcPr>
+            <w:tcW w:type="dxa" w:w="8164"/>
+          </w:tcPr>
+          <w:p>
+            <w:r>
+              <w:rPr>
+                <w:sz w:val="16"/>
+                <w:b w:val="0"/>
+              </w:rPr>
+              <w:t xml:space="preserve">Simple; no assumption about how the tests depend on each other.</w:t>
+            </w:r>
+          </w:p>
+        </w:tc>
+      </w:tr>
+      <w:tr>
+        <w:tc>
+          <w:tcPr>
+            <w:tcW w:type="dxa" w:w="1701"/>
+          </w:tcPr>
+          <w:p>
+            <w:r>
+              <w:rPr>
+                <w:b/>
+                <w:sz w:val="16"/>
+              </w:rPr>
+              <w:t>Weaknesses / critique</w:t>
+            </w:r>
+          </w:p>
+        </w:tc>
+        <w:tc>
+          <w:tcPr>
+            <w:tcW w:type="dxa" w:w="8164"/>
+          </w:tcPr>
+          <w:p>
+            <w:r>
+              <w:rPr>
+                <w:sz w:val="16"/>
+                <w:b w:val="0"/>
+              </w:rPr>
+              <w:t xml:space="preserve">Conservative when there are many correlated tests.</w:t>
+            </w:r>
+          </w:p>
+        </w:tc>
+      </w:tr>
+      <w:tr>
+        <w:tc>
+          <w:tcPr>
+            <w:tcW w:type="dxa" w:w="1701"/>
+            <w:shd w:val="clear" w:color="auto" w:fill="EAF1FB"/>
+          </w:tcPr>
+          <w:p>
+            <w:r>
+              <w:rPr>
+                <w:b/>
+                <w:sz w:val="16"/>
+              </w:rPr>
+              <w:t>Use it as · where</w:t>
+            </w:r>
+          </w:p>
+        </w:tc>
+        <w:tc>
+          <w:tcPr>
+            <w:tcW w:type="dxa" w:w="8164"/>
+            <w:shd w:val="clear" w:color="auto" w:fill="EAF1FB"/>
+          </w:tcPr>
+          <w:p>
+            <w:r>
+              <w:rPr>
+                <w:sz w:val="16"/>
+                <w:b w:val="0"/>
+              </w:rPr>
+              <w:t xml:space="preserve">Method · Chapter 3 (E4)</w:t>
+            </w:r>
+          </w:p>
+        </w:tc>
+      </w:tr>
+    </w:tbl>
+    <w:p>
+      <w:pPr>
+        <w:spacing w:after="80"/>
+      </w:pPr>
+    </w:p>
+    <w:p>
+      <w:pPr>
         <w:pStyle w:val="Heading1"/>
       </w:pPr>
       <w:r>
         <w:rPr>
           <w:color w:val="1F4E79"/>
         </w:rPr>
-        <w:t xml:space="preserve">E. Reading order (about 28 hours in total)</w:t>
+        <w:t xml:space="preserve">E. Reading order (about 32 hours in total)</w:t>
       </w:r>
     </w:p>
     <w:tbl>
@@ -23994,6 +28547,50 @@
                 <w:b w:val="0"/>
               </w:rPr>
               <w:t xml:space="preserve">3</w:t>
+            </w:r>
+          </w:p>
+        </w:tc>
+      </w:tr>
+      <w:tr>
+        <w:tc>
+          <w:tcPr>
+            <w:tcW w:type="dxa" w:w="850"/>
+          </w:tcPr>
+          <w:p>
+            <w:r>
+              <w:rPr>
+                <w:sz w:val="17"/>
+                <w:b w:val="0"/>
+              </w:rPr>
+              <w:t xml:space="preserve">Now (A2–A3)</w:t>
+            </w:r>
+          </w:p>
+        </w:tc>
+        <w:tc>
+          <w:tcPr>
+            <w:tcW w:type="dxa" w:w="7654"/>
+          </w:tcPr>
+          <w:p>
+            <w:r>
+              <w:rPr>
+                <w:sz w:val="17"/>
+                <w:b w:val="0"/>
+              </w:rPr>
+              <w:t xml:space="preserve">Branco et al. (2024) data and results; Audrino &amp; Chassot (2024) Sections 4.3 and 5; Corsi &amp; Renò (2012) model section; Breiman (2001) definition and out-of-bag; Bates &amp; Granger (1969)</w:t>
+            </w:r>
+          </w:p>
+        </w:tc>
+        <w:tc>
+          <w:tcPr>
+            <w:tcW w:type="dxa" w:w="1361"/>
+          </w:tcPr>
+          <w:p>
+            <w:r>
+              <w:rPr>
+                <w:sz w:val="17"/>
+                <w:b w:val="0"/>
+              </w:rPr>
+              <w:t xml:space="preserve">4</w:t>
             </w:r>
           </w:p>
         </w:tc>
@@ -25220,6 +29817,306 @@
                 <w:b w:val="0"/>
               </w:rPr>
               <w:t xml:space="preserve">ideas.repec.org/a/eee/jimfin/v160y2026ics0261560625002025.html (full text via the DBS library)</w:t>
+            </w:r>
+          </w:p>
+        </w:tc>
+      </w:tr>
+      <w:tr>
+        <w:tc>
+          <w:tcPr>
+            <w:tcW w:type="dxa" w:w="2835"/>
+          </w:tcPr>
+          <w:p>
+            <w:r>
+              <w:rPr>
+                <w:sz w:val="17"/>
+                <w:b w:val="0"/>
+              </w:rPr>
+              <w:t xml:space="preserve">Branco et al. (2024)</w:t>
+            </w:r>
+          </w:p>
+        </w:tc>
+        <w:tc>
+          <w:tcPr>
+            <w:tcW w:type="dxa" w:w="7030"/>
+          </w:tcPr>
+          <w:p>
+            <w:r>
+              <w:rPr>
+                <w:sz w:val="17"/>
+                <w:b w:val="0"/>
+              </w:rPr>
+              <w:t xml:space="preserve">doi.org/10.1016/j.jempfin.2024.101524 (working paper: papers.ssrn.com/sol3/papers.cfm?abstract_id=4445161)</w:t>
+            </w:r>
+          </w:p>
+        </w:tc>
+      </w:tr>
+      <w:tr>
+        <w:tc>
+          <w:tcPr>
+            <w:tcW w:type="dxa" w:w="2835"/>
+          </w:tcPr>
+          <w:p>
+            <w:r>
+              <w:rPr>
+                <w:sz w:val="17"/>
+                <w:b w:val="0"/>
+              </w:rPr>
+              <w:t xml:space="preserve">Audrino &amp; Chassot (2024)</w:t>
+            </w:r>
+          </w:p>
+        </w:tc>
+        <w:tc>
+          <w:tcPr>
+            <w:tcW w:type="dxa" w:w="7030"/>
+          </w:tcPr>
+          <w:p>
+            <w:r>
+              <w:rPr>
+                <w:sz w:val="17"/>
+                <w:b w:val="0"/>
+              </w:rPr>
+              <w:t xml:space="preserve">arxiv.org/abs/2406.08041</w:t>
+            </w:r>
+          </w:p>
+        </w:tc>
+      </w:tr>
+      <w:tr>
+        <w:tc>
+          <w:tcPr>
+            <w:tcW w:type="dxa" w:w="2835"/>
+          </w:tcPr>
+          <w:p>
+            <w:r>
+              <w:rPr>
+                <w:sz w:val="17"/>
+                <w:b w:val="0"/>
+              </w:rPr>
+              <w:t xml:space="preserve">Teller, Pigorsch &amp; Pigorsch (2022)</w:t>
+            </w:r>
+          </w:p>
+        </w:tc>
+        <w:tc>
+          <w:tcPr>
+            <w:tcW w:type="dxa" w:w="7030"/>
+          </w:tcPr>
+          <w:p>
+            <w:r>
+              <w:rPr>
+                <w:sz w:val="17"/>
+                <w:b w:val="0"/>
+              </w:rPr>
+              <w:t xml:space="preserve">papers.ssrn.com/sol3/papers.cfm?abstract_id=4267541</w:t>
+            </w:r>
+          </w:p>
+        </w:tc>
+      </w:tr>
+      <w:tr>
+        <w:tc>
+          <w:tcPr>
+            <w:tcW w:type="dxa" w:w="2835"/>
+          </w:tcPr>
+          <w:p>
+            <w:r>
+              <w:rPr>
+                <w:sz w:val="17"/>
+                <w:b w:val="0"/>
+              </w:rPr>
+              <w:t xml:space="preserve">Audrino &amp; Knaus (2016)</w:t>
+            </w:r>
+          </w:p>
+        </w:tc>
+        <w:tc>
+          <w:tcPr>
+            <w:tcW w:type="dxa" w:w="7030"/>
+          </w:tcPr>
+          <w:p>
+            <w:r>
+              <w:rPr>
+                <w:sz w:val="17"/>
+                <w:b w:val="0"/>
+              </w:rPr>
+              <w:t xml:space="preserve">Econometric Reviews 35(8–10) — via the DBS library</w:t>
+            </w:r>
+          </w:p>
+        </w:tc>
+      </w:tr>
+      <w:tr>
+        <w:tc>
+          <w:tcPr>
+            <w:tcW w:type="dxa" w:w="2835"/>
+          </w:tcPr>
+          <w:p>
+            <w:r>
+              <w:rPr>
+                <w:sz w:val="17"/>
+                <w:b w:val="0"/>
+              </w:rPr>
+              <w:t xml:space="preserve">Corsi &amp; Renò (2012)</w:t>
+            </w:r>
+          </w:p>
+        </w:tc>
+        <w:tc>
+          <w:tcPr>
+            <w:tcW w:type="dxa" w:w="7030"/>
+          </w:tcPr>
+          <w:p>
+            <w:r>
+              <w:rPr>
+                <w:sz w:val="17"/>
+                <w:b w:val="0"/>
+              </w:rPr>
+              <w:t xml:space="preserve">Journal of Business &amp; Economic Statistics 30(3) — via the DBS library</w:t>
+            </w:r>
+          </w:p>
+        </w:tc>
+      </w:tr>
+      <w:tr>
+        <w:tc>
+          <w:tcPr>
+            <w:tcW w:type="dxa" w:w="2835"/>
+          </w:tcPr>
+          <w:p>
+            <w:r>
+              <w:rPr>
+                <w:sz w:val="17"/>
+                <w:b w:val="0"/>
+              </w:rPr>
+              <w:t xml:space="preserve">Breiman (2001)</w:t>
+            </w:r>
+          </w:p>
+        </w:tc>
+        <w:tc>
+          <w:tcPr>
+            <w:tcW w:type="dxa" w:w="7030"/>
+          </w:tcPr>
+          <w:p>
+            <w:r>
+              <w:rPr>
+                <w:sz w:val="17"/>
+                <w:b w:val="0"/>
+              </w:rPr>
+              <w:t xml:space="preserve">Machine Learning 45(1) — via the DBS library</w:t>
+            </w:r>
+          </w:p>
+        </w:tc>
+      </w:tr>
+      <w:tr>
+        <w:tc>
+          <w:tcPr>
+            <w:tcW w:type="dxa" w:w="2835"/>
+          </w:tcPr>
+          <w:p>
+            <w:r>
+              <w:rPr>
+                <w:sz w:val="17"/>
+                <w:b w:val="0"/>
+              </w:rPr>
+              <w:t xml:space="preserve">Chen &amp; Guestrin (2016)</w:t>
+            </w:r>
+          </w:p>
+        </w:tc>
+        <w:tc>
+          <w:tcPr>
+            <w:tcW w:type="dxa" w:w="7030"/>
+          </w:tcPr>
+          <w:p>
+            <w:r>
+              <w:rPr>
+                <w:sz w:val="17"/>
+                <w:b w:val="0"/>
+              </w:rPr>
+              <w:t xml:space="preserve">arxiv.org/abs/1603.02754</w:t>
+            </w:r>
+          </w:p>
+        </w:tc>
+      </w:tr>
+      <w:tr>
+        <w:tc>
+          <w:tcPr>
+            <w:tcW w:type="dxa" w:w="2835"/>
+          </w:tcPr>
+          <w:p>
+            <w:r>
+              <w:rPr>
+                <w:sz w:val="17"/>
+                <w:b w:val="0"/>
+              </w:rPr>
+              <w:t xml:space="preserve">Drucker et al. (1997)</w:t>
+            </w:r>
+          </w:p>
+        </w:tc>
+        <w:tc>
+          <w:tcPr>
+            <w:tcW w:type="dxa" w:w="7030"/>
+          </w:tcPr>
+          <w:p>
+            <w:r>
+              <w:rPr>
+                <w:sz w:val="17"/>
+                <w:b w:val="0"/>
+              </w:rPr>
+              <w:t xml:space="preserve">NIPS 9 proceedings — papers.nips.cc</w:t>
+            </w:r>
+          </w:p>
+        </w:tc>
+      </w:tr>
+      <w:tr>
+        <w:tc>
+          <w:tcPr>
+            <w:tcW w:type="dxa" w:w="2835"/>
+          </w:tcPr>
+          <w:p>
+            <w:r>
+              <w:rPr>
+                <w:sz w:val="17"/>
+                <w:b w:val="0"/>
+              </w:rPr>
+              <w:t xml:space="preserve">Bates &amp; Granger (1969)</w:t>
+            </w:r>
+          </w:p>
+        </w:tc>
+        <w:tc>
+          <w:tcPr>
+            <w:tcW w:type="dxa" w:w="7030"/>
+          </w:tcPr>
+          <w:p>
+            <w:r>
+              <w:rPr>
+                <w:sz w:val="17"/>
+                <w:b w:val="0"/>
+              </w:rPr>
+              <w:t xml:space="preserve">Operational Research Quarterly 20(4) — JSTOR via the DBS library</w:t>
+            </w:r>
+          </w:p>
+        </w:tc>
+      </w:tr>
+      <w:tr>
+        <w:tc>
+          <w:tcPr>
+            <w:tcW w:type="dxa" w:w="2835"/>
+          </w:tcPr>
+          <w:p>
+            <w:r>
+              <w:rPr>
+                <w:sz w:val="17"/>
+                <w:b w:val="0"/>
+              </w:rPr>
+              <w:t xml:space="preserve">Holm (1979)</w:t>
+            </w:r>
+          </w:p>
+        </w:tc>
+        <w:tc>
+          <w:tcPr>
+            <w:tcW w:type="dxa" w:w="7030"/>
+          </w:tcPr>
+          <w:p>
+            <w:r>
+              <w:rPr>
+                <w:sz w:val="17"/>
+                <w:b w:val="0"/>
+              </w:rPr>
+              <w:t xml:space="preserve">Scandinavian Journal of Statistics 6(2) — JSTOR via the DBS library</w:t>
             </w:r>
           </w:p>
         </w:tc>

</xml_diff>